<commit_message>
Align ODAXY outreach messages with ICP research
Remove claims the research doesn't support, add Technical Director/CTO and
content-role variants, add a review-based direct opener for ICP 1, and match
target roles to the Sales Navigator titles.

Co-Authored-By: Claude Opus 5.5 <noreply@anthropic.com>
Claude-Session: https://claude.ai/code/session_01Lr1syY3hkLeZYJhtN2s4Rg
</commit_message>
<xml_diff>
--- a/Outreach Messages - ODAXY Labs.docx
+++ b/Outreach Messages - ODAXY Labs.docx
@@ -155,7 +155,7 @@
     <w:p>
       <w:r>
         <w:rPr/>
-        <w:t xml:space="preserve">Within these companies, we will, wherever possible, reach out to a few decision-makers per company, depending on availability. The roles are defined in the ICP: for ICP 1 and ICP 3 the Founder, CEO or Owner, with the Head of Product or Head of Growth as a strong entry point; for ICP 2 the Owner, Founder or Principal, and the Technical Director.</w:t>
+        <w:t xml:space="preserve">Within these companies, we will, wherever possible, reach out to a few decision-makers per company, depending on availability. The roles are defined in the ICP: for ICP 1 the Founder, Co-Founder, CEO, Owner or President; for ICP 2 the Owner, Founder, President or Managing Director, plus the Technical Director, CTO or Head of Delivery; for ICP 3 the Founder or CEO, plus the Director or Head of Product, Head of Growth, Chief Editor or Head of Content.</w:t>
       </w:r>
     </w:p>
     <w:p>
@@ -635,6 +635,89 @@
     </w:p>
     <w:p>
       <w:pPr>
+        <w:spacing w:before="200" w:after="0"/>
+      </w:pPr>
+      <w:r>
+        <w:rPr>
+          <w:b w:val="1"/>
+          <w:bCs w:val="1"/>
+          <w:i w:val="1"/>
+          <w:iCs w:val="1"/>
+        </w:rPr>
+        <w:t xml:space="preserve">Direct version (low rating or reviews mentioning crashes, GPS or login problems)</w:t>
+      </w:r>
+    </w:p>
+    <w:p>
+      <w:pPr>
+        <w:pBdr>
+          <w:top w:color="4f81bd" w:space="10" w:sz="4" w:val="single"/>
+          <w:bottom w:color="4f81bd" w:space="10" w:sz="4" w:val="single"/>
+        </w:pBdr>
+        <w:spacing w:after="240" w:before="240" w:line="240" w:lineRule="auto"/>
+        <w:ind w:left="720"/>
+        <w:jc w:val="left"/>
+      </w:pPr>
+      <w:r>
+        <w:rPr>
+          <w:i w:val="1"/>
+          <w:iCs w:val="1"/>
+        </w:rPr>
+        <w:t xml:space="preserve">Thanks for adding me, </w:t>
+      </w:r>
+      <w:r>
+        <w:rPr>
+          <w:b w:val="1"/>
+          <w:bCs w:val="1"/>
+          <w:i w:val="1"/>
+          <w:iCs w:val="1"/>
+          <w:color w:val="FF9900"/>
+        </w:rPr>
+        <w:t xml:space="preserve">[First Name]</w:t>
+      </w:r>
+      <w:r>
+        <w:rPr>
+          <w:i w:val="1"/>
+          <w:iCs w:val="1"/>
+        </w:rPr>
+        <w:t xml:space="preserve">. I was reading the reviews for </w:t>
+      </w:r>
+      <w:r>
+        <w:rPr>
+          <w:b w:val="1"/>
+          <w:bCs w:val="1"/>
+          <w:i w:val="1"/>
+          <w:iCs w:val="1"/>
+          <w:color w:val="FF9900"/>
+        </w:rPr>
+        <w:t xml:space="preserve">{app name}</w:t>
+      </w:r>
+      <w:r>
+        <w:rPr>
+          <w:i w:val="1"/>
+          <w:iCs w:val="1"/>
+        </w:rPr>
+        <w:t xml:space="preserve">, and a few people mentioned </w:t>
+      </w:r>
+      <w:r>
+        <w:rPr>
+          <w:b w:val="1"/>
+          <w:bCs w:val="1"/>
+          <w:i w:val="1"/>
+          <w:iCs w:val="1"/>
+          <w:color w:val="FF9900"/>
+        </w:rPr>
+        <w:t xml:space="preserve">{issue from reviews}</w:t>
+      </w:r>
+      <w:r>
+        <w:rPr>
+          <w:i w:val="1"/>
+          <w:iCs w:val="1"/>
+        </w:rPr>
+        <w:t xml:space="preserve">. Is that something you're already working on, or has it been hard to find the right people for it?</w:t>
+      </w:r>
+    </w:p>
+    <w:p>
+      <w:pPr>
         <w:spacing w:before="60" w:after="120"/>
       </w:pPr>
       <w:r>
@@ -885,7 +968,7 @@
           <w:i w:val="1"/>
           <w:iCs w:val="1"/>
         </w:rPr>
-        <w:t xml:space="preserve">, I jumped into questions without properly introducing myself. I'm Igor, founder of ODAXY Labs. I've been building mobile apps for 15+ years, and a lot of our work is taking over apps someone else built. For example, we rebuilt both the iOS and Android apps for a GPS audio-tour company in Los Angeles, with offline maps and turn-by-turn navigation, while the apps stayed live in the stores. If interested, happy to share how we did it.</w:t>
+        <w:t xml:space="preserve">, I jumped into questions without properly introducing myself. I'm Igor, founder of ODAXY Labs. I've been building mobile apps for 15+ years, and we take over and rebuild apps that someone else built. For example, we rebuilt both the iOS and Android apps for a GPS audio-tour company in Los Angeles, with offline maps and turn-by-turn navigation, while the apps stayed live in the stores. If interested, happy to share how we did it.</w:t>
       </w:r>
     </w:p>
     <w:p>
@@ -1320,6 +1403,72 @@
     </w:p>
     <w:p>
       <w:pPr>
+        <w:spacing w:before="200" w:after="0"/>
+      </w:pPr>
+      <w:r>
+        <w:rPr>
+          <w:b w:val="1"/>
+          <w:bCs w:val="1"/>
+          <w:i w:val="1"/>
+          <w:iCs w:val="1"/>
+        </w:rPr>
+        <w:t xml:space="preserve">Technical Director / CTO / Head of Delivery</w:t>
+      </w:r>
+    </w:p>
+    <w:p>
+      <w:pPr>
+        <w:pBdr>
+          <w:top w:color="4f81bd" w:space="10" w:sz="4" w:val="single"/>
+          <w:bottom w:color="4f81bd" w:space="10" w:sz="4" w:val="single"/>
+        </w:pBdr>
+        <w:spacing w:after="240" w:before="240" w:line="240" w:lineRule="auto"/>
+        <w:ind w:left="720"/>
+        <w:jc w:val="left"/>
+      </w:pPr>
+      <w:r>
+        <w:rPr>
+          <w:i w:val="1"/>
+          <w:iCs w:val="1"/>
+        </w:rPr>
+        <w:t xml:space="preserve">I had a thought, </w:t>
+      </w:r>
+      <w:r>
+        <w:rPr>
+          <w:b w:val="1"/>
+          <w:bCs w:val="1"/>
+          <w:i w:val="1"/>
+          <w:iCs w:val="1"/>
+          <w:color w:val="FF9900"/>
+        </w:rPr>
+        <w:t xml:space="preserve">[First Name]</w:t>
+      </w:r>
+      <w:r>
+        <w:rPr>
+          <w:i w:val="1"/>
+          <w:iCs w:val="1"/>
+        </w:rPr>
+        <w:t xml:space="preserve">. When an outside team builds a client app, you're still the one answering for the code. And briefing that team properly can take almost as long as doing the work yourself. How do you handle that at </w:t>
+      </w:r>
+      <w:r>
+        <w:rPr>
+          <w:b w:val="1"/>
+          <w:bCs w:val="1"/>
+          <w:i w:val="1"/>
+          <w:iCs w:val="1"/>
+          <w:color w:val="FF9900"/>
+        </w:rPr>
+        <w:t xml:space="preserve">{company name}</w:t>
+      </w:r>
+      <w:r>
+        <w:rPr>
+          <w:i w:val="1"/>
+          <w:iCs w:val="1"/>
+        </w:rPr>
+        <w:t xml:space="preserve">?</w:t>
+      </w:r>
+    </w:p>
+    <w:p>
+      <w:pPr>
         <w:spacing w:before="60" w:after="120"/>
       </w:pPr>
       <w:r>
@@ -1371,6 +1520,20 @@
     </w:p>
     <w:p>
       <w:pPr>
+        <w:spacing w:before="200" w:after="0"/>
+      </w:pPr>
+      <w:r>
+        <w:rPr>
+          <w:b w:val="1"/>
+          <w:bCs w:val="1"/>
+          <w:i w:val="1"/>
+          <w:iCs w:val="1"/>
+        </w:rPr>
+        <w:t xml:space="preserve">Owner / Founder / Managing Director</w:t>
+      </w:r>
+    </w:p>
+    <w:p>
+      <w:pPr>
         <w:pBdr>
           <w:top w:color="4f81bd" w:space="10" w:sz="4" w:val="single"/>
           <w:bottom w:color="4f81bd" w:space="10" w:sz="4" w:val="single"/>
@@ -1402,6 +1565,55 @@
           <w:iCs w:val="1"/>
         </w:rPr>
         <w:t xml:space="preserve">, I jumped into questions without introducing myself. I'm Igor, founder of ODAXY Labs. We build mobile apps for agencies and MSPs behind the scenes, so your client only deals with you. For a web agency in Pennsylvania, the first version was ready in about six weeks, and we've built inspection apps for an IT company in Florida. You talk to me directly, not an account manager. If interested, happy to share how we set those up.</w:t>
+      </w:r>
+    </w:p>
+    <w:p>
+      <w:pPr>
+        <w:spacing w:before="200" w:after="0"/>
+      </w:pPr>
+      <w:r>
+        <w:rPr>
+          <w:b w:val="1"/>
+          <w:bCs w:val="1"/>
+          <w:i w:val="1"/>
+          <w:iCs w:val="1"/>
+        </w:rPr>
+        <w:t xml:space="preserve">Technical Director / CTO / Head of Delivery</w:t>
+      </w:r>
+    </w:p>
+    <w:p>
+      <w:pPr>
+        <w:pBdr>
+          <w:top w:color="4f81bd" w:space="10" w:sz="4" w:val="single"/>
+          <w:bottom w:color="4f81bd" w:space="10" w:sz="4" w:val="single"/>
+        </w:pBdr>
+        <w:spacing w:after="240" w:before="240" w:line="240" w:lineRule="auto"/>
+        <w:ind w:left="720"/>
+        <w:jc w:val="left"/>
+      </w:pPr>
+      <w:r>
+        <w:rPr>
+          <w:i w:val="1"/>
+          <w:iCs w:val="1"/>
+        </w:rPr>
+        <w:t xml:space="preserve">Sorry, </w:t>
+      </w:r>
+      <w:r>
+        <w:rPr>
+          <w:b w:val="1"/>
+          <w:bCs w:val="1"/>
+          <w:i w:val="1"/>
+          <w:iCs w:val="1"/>
+          <w:color w:val="FF9900"/>
+        </w:rPr>
+        <w:t xml:space="preserve">[First Name]</w:t>
+      </w:r>
+      <w:r>
+        <w:rPr>
+          <w:i w:val="1"/>
+          <w:iCs w:val="1"/>
+        </w:rPr>
+        <w:t xml:space="preserve">, I jumped into questions without introducing myself. I'm Igor, founder of ODAXY Labs, and I've been a developer for 15+ years. We build native iOS, Android and Flutter apps for agencies and MSPs, under their name. You'd work with me directly, and the scope and technical documentation are agreed before we write any code. If interested, happy to share how we set it up with a web agency in Pennsylvania.</w:t>
       </w:r>
     </w:p>
     <w:p>
@@ -1416,7 +1628,7 @@
           <w:sz w:val="22"/>
           <w:szCs w:val="22"/>
         </w:rPr>
-        <w:t xml:space="preserve">Response suggestion: if they ask how it works, keep it simple: scope agreed in writing before we start, direct contact with Igor, the work goes out under their name. If a Technical Director joins the conversation, it's fine to get more technical.</w:t>
+        <w:t xml:space="preserve">Response suggestion: if they ask how it works, keep it simple: scope agreed in writing before we start, direct contact with Igor, the work goes out under their name.</w:t>
       </w:r>
     </w:p>
     <w:p>
@@ -1721,6 +1933,20 @@
     </w:p>
     <w:p>
       <w:pPr>
+        <w:spacing w:before="200" w:after="0"/>
+      </w:pPr>
+      <w:r>
+        <w:rPr>
+          <w:b w:val="1"/>
+          <w:bCs w:val="1"/>
+          <w:i w:val="1"/>
+          <w:iCs w:val="1"/>
+        </w:rPr>
+        <w:t xml:space="preserve">Founder / CEO / Chief Editor / Head of Content</w:t>
+      </w:r>
+    </w:p>
+    <w:p>
+      <w:pPr>
         <w:pBdr>
           <w:top w:color="4f81bd" w:space="10" w:sz="4" w:val="single"/>
           <w:bottom w:color="4f81bd" w:space="10" w:sz="4" w:val="single"/>
@@ -2235,7 +2461,7 @@
           <w:i w:val="1"/>
           <w:iCs w:val="1"/>
         </w:rPr>
-        <w:t xml:space="preserve">. Since this year, Apple only accepts updates built with its latest tools, and Google shows apps that fall behind to fewer users. I'm doing a free limited technical audit, a short written note on where an app stands and what it would take to sort out. Would that be useful? Best, Igor</w:t>
+        <w:t xml:space="preserve">. Since this year, Apple only accepts updates built with its latest tools, and Google stops showing apps that fall behind to people with newer Android phones. I'm doing a free limited technical audit, a short written note on where an app stands and what it would take to sort out. Would that be useful? Best, Igor</w:t>
       </w:r>
     </w:p>
     <w:p>
@@ -2584,7 +2810,7 @@
           <w:i w:val="1"/>
           <w:iCs w:val="1"/>
         </w:rPr>
-        <w:t xml:space="preserve">Following up. The part most owners miss isn't the update itself. About 15% of users delete an app after a single crash, and most don't come back. So ratings and downloads slip, and it's hard to tell why.</w:t>
+        <w:t xml:space="preserve">Following up. The part most owners miss isn't the update itself. About 15% of users delete an app after a single crash, and more than half leave after two or three. So ratings and downloads slip, and it's hard to tell why.</w:t>
       </w:r>
     </w:p>
     <w:p>
@@ -3082,7 +3308,7 @@
           <w:i w:val="1"/>
           <w:iCs w:val="1"/>
         </w:rPr>
-        <w:t xml:space="preserve">Following up. Agency owners tell us the biggest risk isn't the price, it's a partner who goes quiet before a deadline.</w:t>
+        <w:t xml:space="preserve">Following up. For most agency owners, the biggest risk isn't the price. It's losing a retainer client because a partner missed a deadline.</w:t>
       </w:r>
     </w:p>
     <w:p>

</xml_diff>

<commit_message>
Make ICP 1 opener fit all segments without a variable
Co-Authored-By: Claude Opus 5.5 <noreply@anthropic.com>
Claude-Session: https://claude.ai/code/session_01Lr1syY3hkLeZYJhtN2s4Rg
</commit_message>
<xml_diff>
--- a/Outreach Messages - ODAXY Labs.docx
+++ b/Outreach Messages - ODAXY Labs.docx
@@ -631,26 +631,7 @@
           <w:iCs w:val="1"/>
           <w:rtl w:val="0"/>
         </w:rPr>
-        <w:t xml:space="preserve">. Curious what you think. I've been talking to a few people who run </w:t>
-      </w:r>
-      <w:r>
-        <w:rPr>
-          <w:b w:val="1"/>
-          <w:bCs w:val="1"/>
-          <w:i w:val="1"/>
-          <w:iCs w:val="1"/>
-          <w:color w:val="ff9900"/>
-          <w:rtl w:val="0"/>
-        </w:rPr>
-        <w:t xml:space="preserve">{industry}</w:t>
-      </w:r>
-      <w:r>
-        <w:rPr>
-          <w:i w:val="1"/>
-          <w:iCs w:val="1"/>
-          <w:rtl w:val="0"/>
-        </w:rPr>
-        <w:t xml:space="preserve"> apps, and opinions seem divided. Some say the app is a nice extra, and the real experience is the visit itself. Others say the app is now the first thing visitors judge them by, before they even show up. Where do you land on that?</w:t>
+        <w:t xml:space="preserve">. Curious what you think. I've been talking to a few companies whose app is part of what they offer, and opinions seem divided. Some say the app is a nice extra, and the experience itself is what really matters. Others say the app is now the first thing people judge them by. Where do you land on that?</w:t>
       </w:r>
       <w:r>
         <w:rPr>
@@ -862,21 +843,6 @@
         <w:rPr>
           <w:rtl w:val="0"/>
         </w:rPr>
-      </w:r>
-    </w:p>
-    <w:p>
-      <w:pPr>
-        <w:spacing w:before="60" w:after="120"/>
-      </w:pPr>
-      <w:r>
-        <w:rPr>
-          <w:i w:val="1"/>
-          <w:iCs w:val="1"/>
-          <w:color w:val="404040"/>
-          <w:sz w:val="22"/>
-          <w:szCs w:val="22"/>
-        </w:rPr>
-        <w:t xml:space="preserve">Note: fill {industry} with the prospect's field, e.g. tour, museum, attraction, or outdoor recreation. For small media companies, use the Direct version instead, since the "visit" angle doesn't apply to them.</w:t>
       </w:r>
     </w:p>
     <w:p>

</xml_diff>

<commit_message>
Match Los Angeles rebuild example to the research wording
Co-Authored-By: Claude Opus 5.5 <noreply@anthropic.com>
Claude-Session: https://claude.ai/code/session_01Lr1syY3hkLeZYJhtN2s4Rg
</commit_message>
<xml_diff>
--- a/Outreach Messages - ODAXY Labs.docx
+++ b/Outreach Messages - ODAXY Labs.docx
@@ -1172,7 +1172,7 @@
           <w:iCs w:val="1"/>
           <w:rtl w:val="0"/>
         </w:rPr>
-        <w:t xml:space="preserve">, I jumped into questions without properly introducing myself. I'm Igor, founder of ODAXY Labs. I've been building mobile apps for 15+ years, and we take over and rebuild apps that someone else built. For example, we rebuilt both the iOS and Android apps for a GPS audio-tour company in Los Angeles, with offline maps and turn-by-turn navigation, while the apps stayed live in the stores. If interested, happy to share how we did it.</w:t>
+        <w:t xml:space="preserve">, I jumped into questions without properly introducing myself. I'm Igor, founder of ODAXY Labs. I've been building mobile apps for 15+ years, and we take over and rebuild apps that someone else built. For example, we rebuilt both the iOS and Android GPS audio-tour apps for a company in Los Angeles, with turn-by-turn navigation and offline mode, while the apps stayed live in the stores. If interested, happy to share how we did it.</w:t>
       </w:r>
       <w:r>
         <w:rPr>
@@ -3649,7 +3649,7 @@
           <w:iCs w:val="1"/>
           <w:rtl w:val="0"/>
         </w:rPr>
-        <w:t xml:space="preserve">We rebuilt both the iOS and Android apps for a GPS audio-tour company in Los Angeles, with offline maps and navigation, while they stayed live in the stores.</w:t>
+        <w:t xml:space="preserve">We rebuilt both the iOS and Android GPS audio-tour apps for a company in Los Angeles, with turn-by-turn navigation and offline mode, while they stayed live in the stores.</w:t>
       </w:r>
       <w:r>
         <w:rPr>
@@ -5327,7 +5327,7 @@
         <w:rPr>
           <w:rtl w:val="0"/>
         </w:rPr>
-        <w:t xml:space="preserve"> "A GPS audio-tour company in Los Angeles" and "a web agency in Pennsylvania" carry the proof without naming anyone.</w:t>
+        <w:t xml:space="preserve"> "GPS audio-tour apps for a company in Los Angeles" and "a web agency in Pennsylvania" carry the proof without naming anyone.</w:t>
       </w:r>
     </w:p>
     <w:p>

</xml_diff>

<commit_message>
Explain the Apple and Google rules where the audit offer mentions them
Co-Authored-By: Claude Opus 5.5 <noreply@anthropic.com>
Claude-Session: https://claude.ai/code/session_01Lr1syY3hkLeZYJhtN2s4Rg
</commit_message>
<xml_diff>
--- a/Outreach Messages - ODAXY Labs.docx
+++ b/Outreach Messages - ODAXY Labs.docx
@@ -1288,31 +1288,7 @@
           <w:iCs w:val="1"/>
           <w:rtl w:val="0"/>
         </w:rPr>
-        <w:t xml:space="preserve">, so I'll stop here before I start to annoy you. One last thing. I'm doing a free limited technical audit for app owners, a short written note on where your app stands with the new Apple and Google rules, what's behind the crashes or bad reviews, and whether it needs a fix or a rebuild. Would you like me to do one for </w:t>
-      </w:r>
-      <w:r>
-        <w:rPr>
-          <w:b w:val="1"/>
-          <w:bCs w:val="1"/>
-          <w:i w:val="1"/>
-          <w:iCs w:val="1"/>
-          <w:color w:val="ff9900"/>
-          <w:rtl w:val="0"/>
-        </w:rPr>
-        <w:t xml:space="preserve">{app name}</w:t>
-      </w:r>
-      <w:r>
-        <w:rPr>
-          <w:i w:val="1"/>
-          <w:iCs w:val="1"/>
-          <w:rtl w:val="0"/>
-        </w:rPr>
-        <w:t xml:space="preserve">?</w:t>
-      </w:r>
-      <w:r>
-        <w:rPr>
-          <w:rtl w:val="0"/>
-        </w:rPr>
+        <w:t xml:space="preserve">, so I'll stop here before I start to annoy you. One last thing worth knowing. Since this year, Apple only accepts app updates built with its latest tools, and Google stops showing apps that fall behind to people with newer Android phones. I'm doing a free, limited technical audit for app owners, a short written note on where your app stands, what's behind any crashes or bad reviews, and whether it needs a fix or a rebuild. Would you like me to do one for your app?</w:t>
       </w:r>
     </w:p>
     <w:p>
@@ -2826,31 +2802,7 @@
           <w:iCs w:val="1"/>
           <w:rtl w:val="0"/>
         </w:rPr>
-        <w:t xml:space="preserve">, so I'll stop here before I start to annoy you. One last thing. I'm doing a free limited technical audit for learning apps, a short written note covering the payment flow, crashes and speed, and the new Apple and Google rules. Would you like me to do one for </w:t>
-      </w:r>
-      <w:r>
-        <w:rPr>
-          <w:b w:val="1"/>
-          <w:bCs w:val="1"/>
-          <w:i w:val="1"/>
-          <w:iCs w:val="1"/>
-          <w:color w:val="ff9900"/>
-          <w:rtl w:val="0"/>
-        </w:rPr>
-        <w:t xml:space="preserve">{app name}</w:t>
-      </w:r>
-      <w:r>
-        <w:rPr>
-          <w:i w:val="1"/>
-          <w:iCs w:val="1"/>
-          <w:rtl w:val="0"/>
-        </w:rPr>
-        <w:t xml:space="preserve">?</w:t>
-      </w:r>
-      <w:r>
-        <w:rPr>
-          <w:rtl w:val="0"/>
-        </w:rPr>
+        <w:t xml:space="preserve">, so I'll stop here before I start to annoy you. One last thing worth knowing. Since this year, Apple only accepts app updates built with its latest tools, and Google stops showing apps that fall behind to people with newer Android phones. I'm doing a free, limited technical audit for learning apps, a short written note on whether your app is affected, plus the payment flow, crashes and speed. Would you like me to do one for your app?</w:t>
       </w:r>
     </w:p>
     <w:p>
@@ -5184,31 +5136,7 @@
           <w:iCs w:val="1"/>
           <w:rtl w:val="0"/>
         </w:rPr>
-        <w:t xml:space="preserve">I can do a free limited technical audit of </w:t>
-      </w:r>
-      <w:r>
-        <w:rPr>
-          <w:b w:val="1"/>
-          <w:bCs w:val="1"/>
-          <w:i w:val="1"/>
-          <w:iCs w:val="1"/>
-          <w:color w:val="ff9900"/>
-          <w:rtl w:val="0"/>
-        </w:rPr>
-        <w:t xml:space="preserve">{app name}</w:t>
-      </w:r>
-      <w:r>
-        <w:rPr>
-          <w:i w:val="1"/>
-          <w:iCs w:val="1"/>
-          <w:rtl w:val="0"/>
-        </w:rPr>
-        <w:t xml:space="preserve"> and send you a short written note covering the payment flow, crashes and speed, and the new Apple and Google rules.</w:t>
-      </w:r>
-      <w:r>
-        <w:rPr>
-          <w:rtl w:val="0"/>
-        </w:rPr>
+        <w:t xml:space="preserve">Since this year, Apple only accepts app updates built with its latest tools, and Google stops showing apps that fall behind to people with newer Android phones. I can do a free, limited technical audit of your app and send you a short written note on whether it's affected, plus the payment flow, crashes and speed.</w:t>
       </w:r>
     </w:p>
     <w:p>

</xml_diff>

<commit_message>
Remove app-data placeholders from the email sequences
Co-Authored-By: Claude Opus 5.5 <noreply@anthropic.com>
Claude-Session: https://claude.ai/code/session_01Lr1syY3hkLeZYJhtN2s4Rg
</commit_message>
<xml_diff>
--- a/Outreach Messages - ODAXY Labs.docx
+++ b/Outreach Messages - ODAXY Labs.docx
@@ -3265,12 +3265,7 @@
           <w:iCs w:val="1"/>
           <w:rtl w:val="0"/>
         </w:rPr>
-        <w:t xml:space="preserve"> Subject: {app name} / quick question about {app name}</w:t>
-      </w:r>
-      <w:r>
-        <w:rPr>
-          <w:rtl w:val="0"/>
-        </w:rPr>
+        <w:t xml:space="preserve"> Subject: quick question / the new app store rules</w:t>
       </w:r>
     </w:p>
     <w:p>
@@ -3356,7 +3351,142 @@
           <w:iCs w:val="1"/>
           <w:rtl w:val="0"/>
         </w:rPr>
-        <w:t xml:space="preserve">I had a look at </w:t>
+        <w:t xml:space="preserve">Since this year, Apple only accepts app updates built with its latest tools, and Google stops showing apps that fall behind to people with newer Android phones. So an app that hasn't been updated in a while can get stuck without anyone noticing.</w:t>
+      </w:r>
+    </w:p>
+    <w:p>
+      <w:pPr>
+        <w:pBdr>
+          <w:top w:color="4f81bd" w:space="10" w:sz="4" w:val="single"/>
+          <w:bottom w:color="4f81bd" w:space="10" w:sz="4" w:val="single"/>
+        </w:pBdr>
+        <w:spacing w:after="240" w:before="240" w:lineRule="auto"/>
+        <w:jc w:val="left"/>
+        <w:rPr/>
+      </w:pPr>
+      <w:r>
+        <w:rPr>
+          <w:i w:val="1"/>
+          <w:iCs w:val="1"/>
+          <w:rtl w:val="0"/>
+        </w:rPr>
+        <w:t xml:space="preserve">Is that something you're already on top of, or has it been sitting on the list?</w:t>
+      </w:r>
+      <w:r>
+        <w:rPr>
+          <w:rtl w:val="0"/>
+        </w:rPr>
+      </w:r>
+    </w:p>
+    <w:p>
+      <w:pPr>
+        <w:pBdr>
+          <w:top w:color="4f81bd" w:space="10" w:sz="4" w:val="single"/>
+          <w:bottom w:color="4f81bd" w:space="10" w:sz="4" w:val="single"/>
+        </w:pBdr>
+        <w:spacing w:after="240" w:before="240" w:lineRule="auto"/>
+        <w:jc w:val="left"/>
+        <w:rPr/>
+      </w:pPr>
+      <w:r>
+        <w:rPr>
+          <w:i w:val="1"/>
+          <w:iCs w:val="1"/>
+          <w:rtl w:val="0"/>
+        </w:rPr>
+        <w:t xml:space="preserve">Best,</w:t>
+      </w:r>
+      <w:r>
+        <w:rPr>
+          <w:rtl w:val="0"/>
+        </w:rPr>
+      </w:r>
+    </w:p>
+    <w:p>
+      <w:pPr>
+        <w:pBdr>
+          <w:top w:color="4f81bd" w:space="10" w:sz="4" w:val="single"/>
+          <w:bottom w:color="4f81bd" w:space="10" w:sz="4" w:val="single"/>
+        </w:pBdr>
+        <w:spacing w:after="240" w:before="240" w:lineRule="auto"/>
+        <w:jc w:val="left"/>
+        <w:rPr/>
+      </w:pPr>
+      <w:r>
+        <w:rPr>
+          <w:i w:val="1"/>
+          <w:iCs w:val="1"/>
+          <w:rtl w:val="0"/>
+        </w:rPr>
+        <w:t xml:space="preserve">Igor</w:t>
+      </w:r>
+      <w:r>
+        <w:rPr>
+          <w:rtl w:val="0"/>
+        </w:rPr>
+      </w:r>
+    </w:p>
+    <w:p>
+      <w:pPr>
+        <w:rPr/>
+      </w:pPr>
+      <w:r>
+        <w:rPr>
+          <w:rtl w:val="0"/>
+        </w:rPr>
+      </w:r>
+    </w:p>
+    <w:p>
+      <w:pPr>
+        <w:pBdr>
+          <w:top w:color="4f81bd" w:space="10" w:sz="4" w:val="single"/>
+          <w:bottom w:color="4f81bd" w:space="10" w:sz="4" w:val="single"/>
+        </w:pBdr>
+        <w:spacing w:after="240" w:before="240" w:lineRule="auto"/>
+        <w:jc w:val="left"/>
+        <w:rPr/>
+      </w:pPr>
+      <w:r>
+        <w:rPr>
+          <w:b w:val="1"/>
+          <w:bCs w:val="1"/>
+          <w:i w:val="1"/>
+          <w:iCs w:val="1"/>
+          <w:rtl w:val="0"/>
+        </w:rPr>
+        <w:t xml:space="preserve">Email 2 — Day 5</w:t>
+      </w:r>
+      <w:r>
+        <w:rPr>
+          <w:i w:val="1"/>
+          <w:iCs w:val="1"/>
+          <w:rtl w:val="0"/>
+        </w:rPr>
+        <w:t xml:space="preserve"> Subject: one more thing / why downloads slip</w:t>
+      </w:r>
+      <w:r>
+        <w:rPr>
+          <w:rtl w:val="0"/>
+        </w:rPr>
+      </w:r>
+    </w:p>
+    <w:p>
+      <w:pPr>
+        <w:pBdr>
+          <w:top w:color="4f81bd" w:space="10" w:sz="4" w:val="single"/>
+          <w:bottom w:color="4f81bd" w:space="10" w:sz="4" w:val="single"/>
+        </w:pBdr>
+        <w:spacing w:after="240" w:before="240" w:lineRule="auto"/>
+        <w:jc w:val="left"/>
+        <w:rPr/>
+      </w:pPr>
+      <w:r>
+        <w:rPr>
+          <w:i w:val="1"/>
+          <w:iCs w:val="1"/>
+          <w:rtl w:val="0"/>
+        </w:rPr>
+        <w:t xml:space="preserve">Hi </w:t>
       </w:r>
       <w:r>
         <w:rPr>
@@ -3367,15 +3497,198 @@
           <w:color w:val="ff9900"/>
           <w:rtl w:val="0"/>
         </w:rPr>
-        <w:t xml:space="preserve">{app name}</w:t>
-      </w:r>
-      <w:r>
-        <w:rPr>
-          <w:i w:val="1"/>
-          <w:iCs w:val="1"/>
-          <w:rtl w:val="0"/>
-        </w:rPr>
-        <w:t xml:space="preserve"> and noticed the last update was in </w:t>
+        <w:t xml:space="preserve">[First Name]</w:t>
+      </w:r>
+      <w:r>
+        <w:rPr>
+          <w:i w:val="1"/>
+          <w:iCs w:val="1"/>
+          <w:rtl w:val="0"/>
+        </w:rPr>
+        <w:t xml:space="preserve">,</w:t>
+      </w:r>
+      <w:r>
+        <w:rPr>
+          <w:rtl w:val="0"/>
+        </w:rPr>
+      </w:r>
+    </w:p>
+    <w:p>
+      <w:pPr>
+        <w:pBdr>
+          <w:top w:color="4f81bd" w:space="10" w:sz="4" w:val="single"/>
+          <w:bottom w:color="4f81bd" w:space="10" w:sz="4" w:val="single"/>
+        </w:pBdr>
+        <w:spacing w:after="240" w:before="240" w:lineRule="auto"/>
+        <w:jc w:val="left"/>
+        <w:rPr/>
+      </w:pPr>
+      <w:r>
+        <w:rPr>
+          <w:i w:val="1"/>
+          <w:iCs w:val="1"/>
+          <w:rtl w:val="0"/>
+        </w:rPr>
+        <w:t xml:space="preserve">Following up. The part most owners miss isn't the update itself. About 15% of users delete an app after a single crash, and more than half leave after two or three. So ratings and downloads slip, and it's hard to tell why.</w:t>
+      </w:r>
+      <w:r>
+        <w:rPr>
+          <w:rtl w:val="0"/>
+        </w:rPr>
+      </w:r>
+    </w:p>
+    <w:p>
+      <w:pPr>
+        <w:pBdr>
+          <w:top w:color="4f81bd" w:space="10" w:sz="4" w:val="single"/>
+          <w:bottom w:color="4f81bd" w:space="10" w:sz="4" w:val="single"/>
+        </w:pBdr>
+        <w:spacing w:after="240" w:before="240" w:lineRule="auto"/>
+        <w:jc w:val="left"/>
+        <w:rPr/>
+      </w:pPr>
+      <w:r>
+        <w:rPr>
+          <w:i w:val="1"/>
+          <w:iCs w:val="1"/>
+          <w:rtl w:val="0"/>
+        </w:rPr>
+        <w:t xml:space="preserve">We rebuilt both the iOS and Android GPS audio-tour apps for a company in Los Angeles, with turn-by-turn navigation and offline mode, while they stayed live in the stores.</w:t>
+      </w:r>
+      <w:r>
+        <w:rPr>
+          <w:rtl w:val="0"/>
+        </w:rPr>
+      </w:r>
+    </w:p>
+    <w:p>
+      <w:pPr>
+        <w:pBdr>
+          <w:top w:color="4f81bd" w:space="10" w:sz="4" w:val="single"/>
+          <w:bottom w:color="4f81bd" w:space="10" w:sz="4" w:val="single"/>
+        </w:pBdr>
+        <w:spacing w:after="240" w:before="240" w:lineRule="auto"/>
+        <w:jc w:val="left"/>
+        <w:rPr/>
+      </w:pPr>
+      <w:r>
+        <w:rPr>
+          <w:i w:val="1"/>
+          <w:iCs w:val="1"/>
+          <w:rtl w:val="0"/>
+        </w:rPr>
+        <w:t xml:space="preserve">Would a couple of examples be useful?</w:t>
+      </w:r>
+      <w:r>
+        <w:rPr>
+          <w:rtl w:val="0"/>
+        </w:rPr>
+      </w:r>
+    </w:p>
+    <w:p>
+      <w:pPr>
+        <w:pBdr>
+          <w:top w:color="4f81bd" w:space="10" w:sz="4" w:val="single"/>
+          <w:bottom w:color="4f81bd" w:space="10" w:sz="4" w:val="single"/>
+        </w:pBdr>
+        <w:spacing w:after="240" w:before="240" w:lineRule="auto"/>
+        <w:jc w:val="left"/>
+        <w:rPr/>
+      </w:pPr>
+      <w:r>
+        <w:rPr>
+          <w:i w:val="1"/>
+          <w:iCs w:val="1"/>
+          <w:rtl w:val="0"/>
+        </w:rPr>
+        <w:t xml:space="preserve">Best,</w:t>
+      </w:r>
+      <w:r>
+        <w:rPr>
+          <w:rtl w:val="0"/>
+        </w:rPr>
+      </w:r>
+    </w:p>
+    <w:p>
+      <w:pPr>
+        <w:pBdr>
+          <w:top w:color="4f81bd" w:space="10" w:sz="4" w:val="single"/>
+          <w:bottom w:color="4f81bd" w:space="10" w:sz="4" w:val="single"/>
+        </w:pBdr>
+        <w:spacing w:after="240" w:before="240" w:lineRule="auto"/>
+        <w:jc w:val="left"/>
+        <w:rPr/>
+      </w:pPr>
+      <w:r>
+        <w:rPr>
+          <w:i w:val="1"/>
+          <w:iCs w:val="1"/>
+          <w:rtl w:val="0"/>
+        </w:rPr>
+        <w:t xml:space="preserve">Igor</w:t>
+      </w:r>
+      <w:r>
+        <w:rPr>
+          <w:rtl w:val="0"/>
+        </w:rPr>
+      </w:r>
+    </w:p>
+    <w:p>
+      <w:pPr>
+        <w:rPr/>
+      </w:pPr>
+      <w:r>
+        <w:rPr>
+          <w:rtl w:val="0"/>
+        </w:rPr>
+      </w:r>
+    </w:p>
+    <w:p>
+      <w:pPr>
+        <w:pBdr>
+          <w:top w:color="4f81bd" w:space="10" w:sz="4" w:val="single"/>
+          <w:bottom w:color="4f81bd" w:space="10" w:sz="4" w:val="single"/>
+        </w:pBdr>
+        <w:spacing w:after="240" w:before="240" w:lineRule="auto"/>
+        <w:jc w:val="left"/>
+        <w:rPr/>
+      </w:pPr>
+      <w:r>
+        <w:rPr>
+          <w:b w:val="1"/>
+          <w:bCs w:val="1"/>
+          <w:i w:val="1"/>
+          <w:iCs w:val="1"/>
+          <w:rtl w:val="0"/>
+        </w:rPr>
+        <w:t xml:space="preserve">Email 3 — Day 10</w:t>
+      </w:r>
+      <w:r>
+        <w:rPr>
+          <w:i w:val="1"/>
+          <w:iCs w:val="1"/>
+          <w:rtl w:val="0"/>
+        </w:rPr>
+        <w:t xml:space="preserve"> Subject: last one from me / a free audit for your app</w:t>
+      </w:r>
+    </w:p>
+    <w:p>
+      <w:pPr>
+        <w:pBdr>
+          <w:top w:color="4f81bd" w:space="10" w:sz="4" w:val="single"/>
+          <w:bottom w:color="4f81bd" w:space="10" w:sz="4" w:val="single"/>
+        </w:pBdr>
+        <w:spacing w:after="240" w:before="240" w:lineRule="auto"/>
+        <w:jc w:val="left"/>
+        <w:rPr/>
+      </w:pPr>
+      <w:r>
+        <w:rPr>
+          <w:i w:val="1"/>
+          <w:iCs w:val="1"/>
+          <w:rtl w:val="0"/>
+        </w:rPr>
+        <w:t xml:space="preserve">Hi </w:t>
       </w:r>
       <w:r>
         <w:rPr>
@@ -3386,39 +3699,82 @@
           <w:color w:val="ff9900"/>
           <w:rtl w:val="0"/>
         </w:rPr>
-        <w:t xml:space="preserve">{last update date}</w:t>
-      </w:r>
-      <w:r>
-        <w:rPr>
-          <w:i w:val="1"/>
-          <w:iCs w:val="1"/>
-          <w:rtl w:val="0"/>
-        </w:rPr>
-        <w:t xml:space="preserve">. Since this year, Apple only accepts updates built with its latest tools, and Google stops showing apps that fall behind to people with newer Android phones.</w:t>
-      </w:r>
-      <w:r>
-        <w:rPr>
-          <w:rtl w:val="0"/>
-        </w:rPr>
-      </w:r>
-    </w:p>
-    <w:p>
-      <w:pPr>
-        <w:pBdr>
-          <w:top w:color="4f81bd" w:space="10" w:sz="4" w:val="single"/>
-          <w:bottom w:color="4f81bd" w:space="10" w:sz="4" w:val="single"/>
-        </w:pBdr>
-        <w:spacing w:after="240" w:before="240" w:lineRule="auto"/>
-        <w:jc w:val="left"/>
-        <w:rPr/>
-      </w:pPr>
-      <w:r>
-        <w:rPr>
-          <w:i w:val="1"/>
-          <w:iCs w:val="1"/>
-          <w:rtl w:val="0"/>
-        </w:rPr>
-        <w:t xml:space="preserve">Is that something you're already on top of, or has it been sitting on the list?</w:t>
+        <w:t xml:space="preserve">[First Name]</w:t>
+      </w:r>
+      <w:r>
+        <w:rPr>
+          <w:i w:val="1"/>
+          <w:iCs w:val="1"/>
+          <w:rtl w:val="0"/>
+        </w:rPr>
+        <w:t xml:space="preserve">,</w:t>
+      </w:r>
+      <w:r>
+        <w:rPr>
+          <w:rtl w:val="0"/>
+        </w:rPr>
+      </w:r>
+    </w:p>
+    <w:p>
+      <w:pPr>
+        <w:pBdr>
+          <w:top w:color="4f81bd" w:space="10" w:sz="4" w:val="single"/>
+          <w:bottom w:color="4f81bd" w:space="10" w:sz="4" w:val="single"/>
+        </w:pBdr>
+        <w:spacing w:after="240" w:before="240" w:lineRule="auto"/>
+        <w:jc w:val="left"/>
+        <w:rPr/>
+      </w:pPr>
+      <w:r>
+        <w:rPr>
+          <w:i w:val="1"/>
+          <w:iCs w:val="1"/>
+          <w:rtl w:val="0"/>
+        </w:rPr>
+        <w:t xml:space="preserve">Last note from me.</w:t>
+      </w:r>
+      <w:r>
+        <w:rPr>
+          <w:rtl w:val="0"/>
+        </w:rPr>
+      </w:r>
+    </w:p>
+    <w:p>
+      <w:pPr>
+        <w:pBdr>
+          <w:top w:color="4f81bd" w:space="10" w:sz="4" w:val="single"/>
+          <w:bottom w:color="4f81bd" w:space="10" w:sz="4" w:val="single"/>
+        </w:pBdr>
+        <w:spacing w:after="240" w:before="240" w:lineRule="auto"/>
+        <w:jc w:val="left"/>
+        <w:rPr/>
+      </w:pPr>
+      <w:r>
+        <w:rPr>
+          <w:i w:val="1"/>
+          <w:iCs w:val="1"/>
+          <w:rtl w:val="0"/>
+        </w:rPr>
+        <w:t xml:space="preserve">If it's useful, I can do a free, limited technical audit of your app. A short written note on where it stands and whether it needs a fix or a rebuild. No strings attached.</w:t>
+      </w:r>
+    </w:p>
+    <w:p>
+      <w:pPr>
+        <w:pBdr>
+          <w:top w:color="4f81bd" w:space="10" w:sz="4" w:val="single"/>
+          <w:bottom w:color="4f81bd" w:space="10" w:sz="4" w:val="single"/>
+        </w:pBdr>
+        <w:spacing w:after="240" w:before="240" w:lineRule="auto"/>
+        <w:jc w:val="left"/>
+        <w:rPr/>
+      </w:pPr>
+      <w:r>
+        <w:rPr>
+          <w:i w:val="1"/>
+          <w:iCs w:val="1"/>
+          <w:rtl w:val="0"/>
+        </w:rPr>
+        <w:t xml:space="preserve">Want me to send it over?</w:t>
       </w:r>
       <w:r>
         <w:rPr>
@@ -3486,6 +3842,268 @@
     </w:p>
     <w:p>
       <w:pPr>
+        <w:pStyle w:val="Heading3"/>
+        <w:rPr/>
+      </w:pPr>
+      <w:r>
+        <w:rPr>
+          <w:rtl w:val="0"/>
+        </w:rPr>
+        <w:t xml:space="preserve">ICP 2 — Small Agencies and MSPs</w:t>
+      </w:r>
+    </w:p>
+    <w:p>
+      <w:pPr>
+        <w:pBdr>
+          <w:top w:color="4f81bd" w:space="10" w:sz="4" w:val="single"/>
+          <w:bottom w:color="4f81bd" w:space="10" w:sz="4" w:val="single"/>
+        </w:pBdr>
+        <w:spacing w:after="240" w:before="240" w:lineRule="auto"/>
+        <w:jc w:val="left"/>
+        <w:rPr/>
+      </w:pPr>
+      <w:r>
+        <w:rPr>
+          <w:b w:val="1"/>
+          <w:bCs w:val="1"/>
+          <w:i w:val="1"/>
+          <w:iCs w:val="1"/>
+          <w:rtl w:val="0"/>
+        </w:rPr>
+        <w:t xml:space="preserve">Email 1 — Day 1</w:t>
+      </w:r>
+      <w:r>
+        <w:rPr>
+          <w:i w:val="1"/>
+          <w:iCs w:val="1"/>
+          <w:rtl w:val="0"/>
+        </w:rPr>
+        <w:t xml:space="preserve"> Subject: linkedin follow up / mobile apps for your clients</w:t>
+      </w:r>
+      <w:r>
+        <w:rPr>
+          <w:rtl w:val="0"/>
+        </w:rPr>
+      </w:r>
+    </w:p>
+    <w:p>
+      <w:pPr>
+        <w:pBdr>
+          <w:top w:color="4f81bd" w:space="10" w:sz="4" w:val="single"/>
+          <w:bottom w:color="4f81bd" w:space="10" w:sz="4" w:val="single"/>
+        </w:pBdr>
+        <w:spacing w:after="240" w:before="240" w:lineRule="auto"/>
+        <w:jc w:val="left"/>
+        <w:rPr/>
+      </w:pPr>
+      <w:r>
+        <w:rPr>
+          <w:i w:val="1"/>
+          <w:iCs w:val="1"/>
+          <w:rtl w:val="0"/>
+        </w:rPr>
+        <w:t xml:space="preserve">Hi </w:t>
+      </w:r>
+      <w:r>
+        <w:rPr>
+          <w:b w:val="1"/>
+          <w:bCs w:val="1"/>
+          <w:i w:val="1"/>
+          <w:iCs w:val="1"/>
+          <w:color w:val="ff9900"/>
+          <w:rtl w:val="0"/>
+        </w:rPr>
+        <w:t xml:space="preserve">[First Name]</w:t>
+      </w:r>
+      <w:r>
+        <w:rPr>
+          <w:i w:val="1"/>
+          <w:iCs w:val="1"/>
+          <w:rtl w:val="0"/>
+        </w:rPr>
+        <w:t xml:space="preserve">,</w:t>
+      </w:r>
+      <w:r>
+        <w:rPr>
+          <w:rtl w:val="0"/>
+        </w:rPr>
+      </w:r>
+    </w:p>
+    <w:p>
+      <w:pPr>
+        <w:pBdr>
+          <w:top w:color="4f81bd" w:space="10" w:sz="4" w:val="single"/>
+          <w:bottom w:color="4f81bd" w:space="10" w:sz="4" w:val="single"/>
+        </w:pBdr>
+        <w:spacing w:after="240" w:before="240" w:lineRule="auto"/>
+        <w:jc w:val="left"/>
+        <w:rPr/>
+      </w:pPr>
+      <w:r>
+        <w:rPr>
+          <w:i w:val="1"/>
+          <w:iCs w:val="1"/>
+          <w:rtl w:val="0"/>
+        </w:rPr>
+        <w:t xml:space="preserve">Tried reaching out on LinkedIn, but figured email might work better.</w:t>
+      </w:r>
+      <w:r>
+        <w:rPr>
+          <w:rtl w:val="0"/>
+        </w:rPr>
+      </w:r>
+    </w:p>
+    <w:p>
+      <w:pPr>
+        <w:pBdr>
+          <w:top w:color="4f81bd" w:space="10" w:sz="4" w:val="single"/>
+          <w:bottom w:color="4f81bd" w:space="10" w:sz="4" w:val="single"/>
+        </w:pBdr>
+        <w:spacing w:after="240" w:before="240" w:lineRule="auto"/>
+        <w:jc w:val="left"/>
+        <w:rPr/>
+      </w:pPr>
+      <w:r>
+        <w:rPr>
+          <w:i w:val="1"/>
+          <w:iCs w:val="1"/>
+          <w:rtl w:val="0"/>
+        </w:rPr>
+        <w:t xml:space="preserve">When a client asks </w:t>
+      </w:r>
+      <w:r>
+        <w:rPr>
+          <w:b w:val="1"/>
+          <w:bCs w:val="1"/>
+          <w:i w:val="1"/>
+          <w:iCs w:val="1"/>
+          <w:color w:val="ff9900"/>
+          <w:rtl w:val="0"/>
+        </w:rPr>
+        <w:t xml:space="preserve">{company name}</w:t>
+      </w:r>
+      <w:r>
+        <w:rPr>
+          <w:i w:val="1"/>
+          <w:iCs w:val="1"/>
+          <w:rtl w:val="0"/>
+        </w:rPr>
+        <w:t xml:space="preserve"> for a mobile app, do you build it, pass it to a partner, or turn it down?</w:t>
+      </w:r>
+      <w:r>
+        <w:rPr>
+          <w:rtl w:val="0"/>
+        </w:rPr>
+      </w:r>
+    </w:p>
+    <w:p>
+      <w:pPr>
+        <w:pBdr>
+          <w:top w:color="4f81bd" w:space="10" w:sz="4" w:val="single"/>
+          <w:bottom w:color="4f81bd" w:space="10" w:sz="4" w:val="single"/>
+        </w:pBdr>
+        <w:spacing w:after="240" w:before="240" w:lineRule="auto"/>
+        <w:jc w:val="left"/>
+        <w:rPr/>
+      </w:pPr>
+      <w:r>
+        <w:rPr>
+          <w:i w:val="1"/>
+          <w:iCs w:val="1"/>
+          <w:rtl w:val="0"/>
+        </w:rPr>
+        <w:t xml:space="preserve">I run ODAXY Labs. We build mobile apps for agencies and MSPs behind the scenes, so your client only deals with you.</w:t>
+      </w:r>
+      <w:r>
+        <w:rPr>
+          <w:rtl w:val="0"/>
+        </w:rPr>
+      </w:r>
+    </w:p>
+    <w:p>
+      <w:pPr>
+        <w:pBdr>
+          <w:top w:color="4f81bd" w:space="10" w:sz="4" w:val="single"/>
+          <w:bottom w:color="4f81bd" w:space="10" w:sz="4" w:val="single"/>
+        </w:pBdr>
+        <w:spacing w:after="240" w:before="240" w:lineRule="auto"/>
+        <w:jc w:val="left"/>
+        <w:rPr/>
+      </w:pPr>
+      <w:r>
+        <w:rPr>
+          <w:i w:val="1"/>
+          <w:iCs w:val="1"/>
+          <w:rtl w:val="0"/>
+        </w:rPr>
+        <w:t xml:space="preserve">Worth a quick chat?</w:t>
+      </w:r>
+      <w:r>
+        <w:rPr>
+          <w:rtl w:val="0"/>
+        </w:rPr>
+      </w:r>
+    </w:p>
+    <w:p>
+      <w:pPr>
+        <w:pBdr>
+          <w:top w:color="4f81bd" w:space="10" w:sz="4" w:val="single"/>
+          <w:bottom w:color="4f81bd" w:space="10" w:sz="4" w:val="single"/>
+        </w:pBdr>
+        <w:spacing w:after="240" w:before="240" w:lineRule="auto"/>
+        <w:jc w:val="left"/>
+        <w:rPr/>
+      </w:pPr>
+      <w:r>
+        <w:rPr>
+          <w:i w:val="1"/>
+          <w:iCs w:val="1"/>
+          <w:rtl w:val="0"/>
+        </w:rPr>
+        <w:t xml:space="preserve">Best,</w:t>
+      </w:r>
+      <w:r>
+        <w:rPr>
+          <w:rtl w:val="0"/>
+        </w:rPr>
+      </w:r>
+    </w:p>
+    <w:p>
+      <w:pPr>
+        <w:pBdr>
+          <w:top w:color="4f81bd" w:space="10" w:sz="4" w:val="single"/>
+          <w:bottom w:color="4f81bd" w:space="10" w:sz="4" w:val="single"/>
+        </w:pBdr>
+        <w:spacing w:after="240" w:before="240" w:lineRule="auto"/>
+        <w:jc w:val="left"/>
+        <w:rPr/>
+      </w:pPr>
+      <w:r>
+        <w:rPr>
+          <w:i w:val="1"/>
+          <w:iCs w:val="1"/>
+          <w:rtl w:val="0"/>
+        </w:rPr>
+        <w:t xml:space="preserve">Igor</w:t>
+      </w:r>
+      <w:r>
+        <w:rPr>
+          <w:rtl w:val="0"/>
+        </w:rPr>
+      </w:r>
+    </w:p>
+    <w:p>
+      <w:pPr>
+        <w:rPr/>
+      </w:pPr>
+      <w:r>
+        <w:rPr>
+          <w:rtl w:val="0"/>
+        </w:rPr>
+      </w:r>
+    </w:p>
+    <w:p>
+      <w:pPr>
         <w:pBdr>
           <w:top w:color="4f81bd" w:space="10" w:sz="4" w:val="single"/>
           <w:bottom w:color="4f81bd" w:space="10" w:sz="4" w:val="single"/>
@@ -3510,7 +4128,7 @@
           <w:iCs w:val="1"/>
           <w:rtl w:val="0"/>
         </w:rPr>
-        <w:t xml:space="preserve"> Subject: one more thing / why downloads slip</w:t>
+        <w:t xml:space="preserve"> Subject: one more thing / the part that matters</w:t>
       </w:r>
       <w:r>
         <w:rPr>
@@ -3577,55 +4195,55 @@
           <w:iCs w:val="1"/>
           <w:rtl w:val="0"/>
         </w:rPr>
-        <w:t xml:space="preserve">Following up. The part most owners miss isn't the update itself. About 15% of users delete an app after a single crash, and more than half leave after two or three. So ratings and downloads slip, and it's hard to tell why.</w:t>
-      </w:r>
-      <w:r>
-        <w:rPr>
-          <w:rtl w:val="0"/>
-        </w:rPr>
-      </w:r>
-    </w:p>
-    <w:p>
-      <w:pPr>
-        <w:pBdr>
-          <w:top w:color="4f81bd" w:space="10" w:sz="4" w:val="single"/>
-          <w:bottom w:color="4f81bd" w:space="10" w:sz="4" w:val="single"/>
-        </w:pBdr>
-        <w:spacing w:after="240" w:before="240" w:lineRule="auto"/>
-        <w:jc w:val="left"/>
-        <w:rPr/>
-      </w:pPr>
-      <w:r>
-        <w:rPr>
-          <w:i w:val="1"/>
-          <w:iCs w:val="1"/>
-          <w:rtl w:val="0"/>
-        </w:rPr>
-        <w:t xml:space="preserve">We rebuilt both the iOS and Android GPS audio-tour apps for a company in Los Angeles, with turn-by-turn navigation and offline mode, while they stayed live in the stores.</w:t>
-      </w:r>
-      <w:r>
-        <w:rPr>
-          <w:rtl w:val="0"/>
-        </w:rPr>
-      </w:r>
-    </w:p>
-    <w:p>
-      <w:pPr>
-        <w:pBdr>
-          <w:top w:color="4f81bd" w:space="10" w:sz="4" w:val="single"/>
-          <w:bottom w:color="4f81bd" w:space="10" w:sz="4" w:val="single"/>
-        </w:pBdr>
-        <w:spacing w:after="240" w:before="240" w:lineRule="auto"/>
-        <w:jc w:val="left"/>
-        <w:rPr/>
-      </w:pPr>
-      <w:r>
-        <w:rPr>
-          <w:i w:val="1"/>
-          <w:iCs w:val="1"/>
-          <w:rtl w:val="0"/>
-        </w:rPr>
-        <w:t xml:space="preserve">Would a couple of examples be useful?</w:t>
+        <w:t xml:space="preserve">Following up. For most agency owners, the biggest risk isn't the price. It's losing a retainer client because a partner missed a deadline.</w:t>
+      </w:r>
+      <w:r>
+        <w:rPr>
+          <w:rtl w:val="0"/>
+        </w:rPr>
+      </w:r>
+    </w:p>
+    <w:p>
+      <w:pPr>
+        <w:pBdr>
+          <w:top w:color="4f81bd" w:space="10" w:sz="4" w:val="single"/>
+          <w:bottom w:color="4f81bd" w:space="10" w:sz="4" w:val="single"/>
+        </w:pBdr>
+        <w:spacing w:after="240" w:before="240" w:lineRule="auto"/>
+        <w:jc w:val="left"/>
+        <w:rPr/>
+      </w:pPr>
+      <w:r>
+        <w:rPr>
+          <w:i w:val="1"/>
+          <w:iCs w:val="1"/>
+          <w:rtl w:val="0"/>
+        </w:rPr>
+        <w:t xml:space="preserve">With us, you talk to me directly, the scope is agreed in writing before we start, and the first version for a web agency in Pennsylvania was ready in about six weeks.</w:t>
+      </w:r>
+      <w:r>
+        <w:rPr>
+          <w:rtl w:val="0"/>
+        </w:rPr>
+      </w:r>
+    </w:p>
+    <w:p>
+      <w:pPr>
+        <w:pBdr>
+          <w:top w:color="4f81bd" w:space="10" w:sz="4" w:val="single"/>
+          <w:bottom w:color="4f81bd" w:space="10" w:sz="4" w:val="single"/>
+        </w:pBdr>
+        <w:spacing w:after="240" w:before="240" w:lineRule="auto"/>
+        <w:jc w:val="left"/>
+        <w:rPr/>
+      </w:pPr>
+      <w:r>
+        <w:rPr>
+          <w:i w:val="1"/>
+          <w:iCs w:val="1"/>
+          <w:rtl w:val="0"/>
+        </w:rPr>
+        <w:t xml:space="preserve">Want me to share how we set it up?</w:t>
       </w:r>
       <w:r>
         <w:rPr>
@@ -3717,7 +4335,7 @@
           <w:iCs w:val="1"/>
           <w:rtl w:val="0"/>
         </w:rPr>
-        <w:t xml:space="preserve"> Subject: last one from me / free audit for {app name}</w:t>
+        <w:t xml:space="preserve"> Subject: last one from me / inherited a client app?</w:t>
       </w:r>
       <w:r>
         <w:rPr>
@@ -3808,7 +4426,154 @@
           <w:iCs w:val="1"/>
           <w:rtl w:val="0"/>
         </w:rPr>
-        <w:t xml:space="preserve">If it's useful, I can do a free limited technical audit of </w:t>
+        <w:t xml:space="preserve">If you have a client app someone else built and you're not sure what's inside, I can do a free limited code review. A short written note on what's there, what's risky, and what it would take to keep it running.</w:t>
+      </w:r>
+      <w:r>
+        <w:rPr>
+          <w:rtl w:val="0"/>
+        </w:rPr>
+      </w:r>
+    </w:p>
+    <w:p>
+      <w:pPr>
+        <w:pBdr>
+          <w:top w:color="4f81bd" w:space="10" w:sz="4" w:val="single"/>
+          <w:bottom w:color="4f81bd" w:space="10" w:sz="4" w:val="single"/>
+        </w:pBdr>
+        <w:spacing w:after="240" w:before="240" w:lineRule="auto"/>
+        <w:jc w:val="left"/>
+        <w:rPr/>
+      </w:pPr>
+      <w:r>
+        <w:rPr>
+          <w:i w:val="1"/>
+          <w:iCs w:val="1"/>
+          <w:rtl w:val="0"/>
+        </w:rPr>
+        <w:t xml:space="preserve">You keep the note either way. Want me to look at one?</w:t>
+      </w:r>
+      <w:r>
+        <w:rPr>
+          <w:rtl w:val="0"/>
+        </w:rPr>
+      </w:r>
+    </w:p>
+    <w:p>
+      <w:pPr>
+        <w:pBdr>
+          <w:top w:color="4f81bd" w:space="10" w:sz="4" w:val="single"/>
+          <w:bottom w:color="4f81bd" w:space="10" w:sz="4" w:val="single"/>
+        </w:pBdr>
+        <w:spacing w:after="240" w:before="240" w:lineRule="auto"/>
+        <w:jc w:val="left"/>
+        <w:rPr/>
+      </w:pPr>
+      <w:r>
+        <w:rPr>
+          <w:i w:val="1"/>
+          <w:iCs w:val="1"/>
+          <w:rtl w:val="0"/>
+        </w:rPr>
+        <w:t xml:space="preserve">Best,</w:t>
+      </w:r>
+      <w:r>
+        <w:rPr>
+          <w:rtl w:val="0"/>
+        </w:rPr>
+      </w:r>
+    </w:p>
+    <w:p>
+      <w:pPr>
+        <w:pBdr>
+          <w:top w:color="4f81bd" w:space="10" w:sz="4" w:val="single"/>
+          <w:bottom w:color="4f81bd" w:space="10" w:sz="4" w:val="single"/>
+        </w:pBdr>
+        <w:spacing w:after="240" w:before="240" w:lineRule="auto"/>
+        <w:jc w:val="left"/>
+        <w:rPr/>
+      </w:pPr>
+      <w:r>
+        <w:rPr>
+          <w:i w:val="1"/>
+          <w:iCs w:val="1"/>
+          <w:rtl w:val="0"/>
+        </w:rPr>
+        <w:t xml:space="preserve">Igor</w:t>
+      </w:r>
+      <w:r>
+        <w:rPr>
+          <w:rtl w:val="0"/>
+        </w:rPr>
+      </w:r>
+    </w:p>
+    <w:p>
+      <w:pPr>
+        <w:rPr/>
+      </w:pPr>
+      <w:r>
+        <w:rPr>
+          <w:rtl w:val="0"/>
+        </w:rPr>
+      </w:r>
+    </w:p>
+    <w:p>
+      <w:pPr>
+        <w:pStyle w:val="Heading3"/>
+        <w:rPr/>
+      </w:pPr>
+      <w:r>
+        <w:rPr>
+          <w:rtl w:val="0"/>
+        </w:rPr>
+        <w:t xml:space="preserve">ICP 3 — Learning, Content and Community App Publishers</w:t>
+      </w:r>
+    </w:p>
+    <w:p>
+      <w:pPr>
+        <w:pBdr>
+          <w:top w:color="4f81bd" w:space="10" w:sz="4" w:val="single"/>
+          <w:bottom w:color="4f81bd" w:space="10" w:sz="4" w:val="single"/>
+        </w:pBdr>
+        <w:spacing w:after="240" w:before="240" w:lineRule="auto"/>
+        <w:jc w:val="left"/>
+        <w:rPr/>
+      </w:pPr>
+      <w:r>
+        <w:rPr>
+          <w:b w:val="1"/>
+          <w:bCs w:val="1"/>
+          <w:i w:val="1"/>
+          <w:iCs w:val="1"/>
+          <w:rtl w:val="0"/>
+        </w:rPr>
+        <w:t xml:space="preserve">Email 1 — Day 1</w:t>
+      </w:r>
+      <w:r>
+        <w:rPr>
+          <w:i w:val="1"/>
+          <w:iCs w:val="1"/>
+          <w:rtl w:val="0"/>
+        </w:rPr>
+        <w:t xml:space="preserve"> Subject: a churn question / quick question</w:t>
+      </w:r>
+    </w:p>
+    <w:p>
+      <w:pPr>
+        <w:pBdr>
+          <w:top w:color="4f81bd" w:space="10" w:sz="4" w:val="single"/>
+          <w:bottom w:color="4f81bd" w:space="10" w:sz="4" w:val="single"/>
+        </w:pBdr>
+        <w:spacing w:after="240" w:before="240" w:lineRule="auto"/>
+        <w:jc w:val="left"/>
+        <w:rPr/>
+      </w:pPr>
+      <w:r>
+        <w:rPr>
+          <w:i w:val="1"/>
+          <w:iCs w:val="1"/>
+          <w:rtl w:val="0"/>
+        </w:rPr>
+        <w:t xml:space="preserve">Hi </w:t>
       </w:r>
       <w:r>
         <w:rPr>
@@ -3819,39 +4584,87 @@
           <w:color w:val="ff9900"/>
           <w:rtl w:val="0"/>
         </w:rPr>
-        <w:t xml:space="preserve">{app name}</w:t>
-      </w:r>
-      <w:r>
-        <w:rPr>
-          <w:i w:val="1"/>
-          <w:iCs w:val="1"/>
-          <w:rtl w:val="0"/>
-        </w:rPr>
-        <w:t xml:space="preserve">. A short written note on where it stands and whether it needs a fix or a rebuild. No strings attached.</w:t>
-      </w:r>
-      <w:r>
-        <w:rPr>
-          <w:rtl w:val="0"/>
-        </w:rPr>
-      </w:r>
-    </w:p>
-    <w:p>
-      <w:pPr>
-        <w:pBdr>
-          <w:top w:color="4f81bd" w:space="10" w:sz="4" w:val="single"/>
-          <w:bottom w:color="4f81bd" w:space="10" w:sz="4" w:val="single"/>
-        </w:pBdr>
-        <w:spacing w:after="240" w:before="240" w:lineRule="auto"/>
-        <w:jc w:val="left"/>
-        <w:rPr/>
-      </w:pPr>
-      <w:r>
-        <w:rPr>
-          <w:i w:val="1"/>
-          <w:iCs w:val="1"/>
-          <w:rtl w:val="0"/>
-        </w:rPr>
-        <w:t xml:space="preserve">Want me to send it over?</w:t>
+        <w:t xml:space="preserve">[First Name]</w:t>
+      </w:r>
+      <w:r>
+        <w:rPr>
+          <w:i w:val="1"/>
+          <w:iCs w:val="1"/>
+          <w:rtl w:val="0"/>
+        </w:rPr>
+        <w:t xml:space="preserve">,</w:t>
+      </w:r>
+      <w:r>
+        <w:rPr>
+          <w:rtl w:val="0"/>
+        </w:rPr>
+      </w:r>
+    </w:p>
+    <w:p>
+      <w:pPr>
+        <w:pBdr>
+          <w:top w:color="4f81bd" w:space="10" w:sz="4" w:val="single"/>
+          <w:bottom w:color="4f81bd" w:space="10" w:sz="4" w:val="single"/>
+        </w:pBdr>
+        <w:spacing w:after="240" w:before="240" w:lineRule="auto"/>
+        <w:jc w:val="left"/>
+        <w:rPr/>
+      </w:pPr>
+      <w:r>
+        <w:rPr>
+          <w:i w:val="1"/>
+          <w:iCs w:val="1"/>
+          <w:rtl w:val="0"/>
+        </w:rPr>
+        <w:t xml:space="preserve">Tried reaching out on LinkedIn, but figured email might work better.</w:t>
+      </w:r>
+      <w:r>
+        <w:rPr>
+          <w:rtl w:val="0"/>
+        </w:rPr>
+      </w:r>
+    </w:p>
+    <w:p>
+      <w:pPr>
+        <w:pBdr>
+          <w:top w:color="4f81bd" w:space="10" w:sz="4" w:val="single"/>
+          <w:bottom w:color="4f81bd" w:space="10" w:sz="4" w:val="single"/>
+        </w:pBdr>
+        <w:spacing w:after="240" w:before="240" w:lineRule="auto"/>
+        <w:jc w:val="left"/>
+        <w:rPr/>
+      </w:pPr>
+      <w:r>
+        <w:rPr>
+          <w:i w:val="1"/>
+          <w:iCs w:val="1"/>
+          <w:rtl w:val="0"/>
+        </w:rPr>
+        <w:t xml:space="preserve">Most teams treat cancellations as a content problem. But on the App Store, around 14% of subscription cancellations are payments that failed. The user never chose to leave.</w:t>
+      </w:r>
+      <w:r>
+        <w:rPr>
+          <w:rtl w:val="0"/>
+        </w:rPr>
+      </w:r>
+    </w:p>
+    <w:p>
+      <w:pPr>
+        <w:pBdr>
+          <w:top w:color="4f81bd" w:space="10" w:sz="4" w:val="single"/>
+          <w:bottom w:color="4f81bd" w:space="10" w:sz="4" w:val="single"/>
+        </w:pBdr>
+        <w:spacing w:after="240" w:before="240" w:lineRule="auto"/>
+        <w:jc w:val="left"/>
+        <w:rPr/>
+      </w:pPr>
+      <w:r>
+        <w:rPr>
+          <w:i w:val="1"/>
+          <w:iCs w:val="1"/>
+          <w:rtl w:val="0"/>
+        </w:rPr>
+        <w:t xml:space="preserve">Do you know how many of yours fall into that bucket?</w:t>
       </w:r>
       <w:r>
         <w:rPr>
@@ -3919,43 +4732,31 @@
     </w:p>
     <w:p>
       <w:pPr>
-        <w:pStyle w:val="Heading3"/>
-        <w:rPr/>
-      </w:pPr>
-      <w:r>
-        <w:rPr>
-          <w:rtl w:val="0"/>
-        </w:rPr>
-        <w:t xml:space="preserve">ICP 2 — Small Agencies and MSPs</w:t>
-      </w:r>
-    </w:p>
-    <w:p>
-      <w:pPr>
-        <w:pBdr>
-          <w:top w:color="4f81bd" w:space="10" w:sz="4" w:val="single"/>
-          <w:bottom w:color="4f81bd" w:space="10" w:sz="4" w:val="single"/>
-        </w:pBdr>
-        <w:spacing w:after="240" w:before="240" w:lineRule="auto"/>
-        <w:jc w:val="left"/>
-        <w:rPr/>
-      </w:pPr>
-      <w:r>
-        <w:rPr>
-          <w:b w:val="1"/>
-          <w:bCs w:val="1"/>
-          <w:i w:val="1"/>
-          <w:iCs w:val="1"/>
-          <w:rtl w:val="0"/>
-        </w:rPr>
-        <w:t xml:space="preserve">Email 1 — Day 1</w:t>
-      </w:r>
-      <w:r>
-        <w:rPr>
-          <w:i w:val="1"/>
-          <w:iCs w:val="1"/>
-          <w:rtl w:val="0"/>
-        </w:rPr>
-        <w:t xml:space="preserve"> Subject: linkedin follow up / mobile apps for your clients</w:t>
+        <w:pBdr>
+          <w:top w:color="4f81bd" w:space="10" w:sz="4" w:val="single"/>
+          <w:bottom w:color="4f81bd" w:space="10" w:sz="4" w:val="single"/>
+        </w:pBdr>
+        <w:spacing w:after="240" w:before="240" w:lineRule="auto"/>
+        <w:jc w:val="left"/>
+        <w:rPr/>
+      </w:pPr>
+      <w:r>
+        <w:rPr>
+          <w:b w:val="1"/>
+          <w:bCs w:val="1"/>
+          <w:i w:val="1"/>
+          <w:iCs w:val="1"/>
+          <w:rtl w:val="0"/>
+        </w:rPr>
+        <w:t xml:space="preserve">Email 2 — Day 5</w:t>
+      </w:r>
+      <w:r>
+        <w:rPr>
+          <w:i w:val="1"/>
+          <w:iCs w:val="1"/>
+          <w:rtl w:val="0"/>
+        </w:rPr>
+        <w:t xml:space="preserve"> Subject: one more thing / the first month</w:t>
       </w:r>
       <w:r>
         <w:rPr>
@@ -4022,98 +4823,55 @@
           <w:iCs w:val="1"/>
           <w:rtl w:val="0"/>
         </w:rPr>
-        <w:t xml:space="preserve">Tried reaching out on LinkedIn, but figured email might work better.</w:t>
-      </w:r>
-      <w:r>
-        <w:rPr>
-          <w:rtl w:val="0"/>
-        </w:rPr>
-      </w:r>
-    </w:p>
-    <w:p>
-      <w:pPr>
-        <w:pBdr>
-          <w:top w:color="4f81bd" w:space="10" w:sz="4" w:val="single"/>
-          <w:bottom w:color="4f81bd" w:space="10" w:sz="4" w:val="single"/>
-        </w:pBdr>
-        <w:spacing w:after="240" w:before="240" w:lineRule="auto"/>
-        <w:jc w:val="left"/>
-        <w:rPr/>
-      </w:pPr>
-      <w:r>
-        <w:rPr>
-          <w:i w:val="1"/>
-          <w:iCs w:val="1"/>
-          <w:rtl w:val="0"/>
-        </w:rPr>
-        <w:t xml:space="preserve">When a client asks </w:t>
-      </w:r>
-      <w:r>
-        <w:rPr>
-          <w:b w:val="1"/>
-          <w:bCs w:val="1"/>
-          <w:i w:val="1"/>
-          <w:iCs w:val="1"/>
-          <w:color w:val="ff9900"/>
-          <w:rtl w:val="0"/>
-        </w:rPr>
-        <w:t xml:space="preserve">{company name}</w:t>
-      </w:r>
-      <w:r>
-        <w:rPr>
-          <w:i w:val="1"/>
-          <w:iCs w:val="1"/>
-          <w:rtl w:val="0"/>
-        </w:rPr>
-        <w:t xml:space="preserve"> for a mobile app, do you build it, pass it to a partner, or turn it down?</w:t>
-      </w:r>
-      <w:r>
-        <w:rPr>
-          <w:rtl w:val="0"/>
-        </w:rPr>
-      </w:r>
-    </w:p>
-    <w:p>
-      <w:pPr>
-        <w:pBdr>
-          <w:top w:color="4f81bd" w:space="10" w:sz="4" w:val="single"/>
-          <w:bottom w:color="4f81bd" w:space="10" w:sz="4" w:val="single"/>
-        </w:pBdr>
-        <w:spacing w:after="240" w:before="240" w:lineRule="auto"/>
-        <w:jc w:val="left"/>
-        <w:rPr/>
-      </w:pPr>
-      <w:r>
-        <w:rPr>
-          <w:i w:val="1"/>
-          <w:iCs w:val="1"/>
-          <w:rtl w:val="0"/>
-        </w:rPr>
-        <w:t xml:space="preserve">I run ODAXY Labs. We build mobile apps for agencies and MSPs behind the scenes, so your client only deals with you.</w:t>
-      </w:r>
-      <w:r>
-        <w:rPr>
-          <w:rtl w:val="0"/>
-        </w:rPr>
-      </w:r>
-    </w:p>
-    <w:p>
-      <w:pPr>
-        <w:pBdr>
-          <w:top w:color="4f81bd" w:space="10" w:sz="4" w:val="single"/>
-          <w:bottom w:color="4f81bd" w:space="10" w:sz="4" w:val="single"/>
-        </w:pBdr>
-        <w:spacing w:after="240" w:before="240" w:lineRule="auto"/>
-        <w:jc w:val="left"/>
-        <w:rPr/>
-      </w:pPr>
-      <w:r>
-        <w:rPr>
-          <w:i w:val="1"/>
-          <w:iCs w:val="1"/>
-          <w:rtl w:val="0"/>
-        </w:rPr>
-        <w:t xml:space="preserve">Worth a quick chat?</w:t>
+        <w:t xml:space="preserve">Following up. About a third of annual-plan cancellations happen in the first month, and a lot of that comes from the app: slow onboarding, crashes, or login issues. Better content doesn't fix any of it.</w:t>
+      </w:r>
+      <w:r>
+        <w:rPr>
+          <w:rtl w:val="0"/>
+        </w:rPr>
+      </w:r>
+    </w:p>
+    <w:p>
+      <w:pPr>
+        <w:pBdr>
+          <w:top w:color="4f81bd" w:space="10" w:sz="4" w:val="single"/>
+          <w:bottom w:color="4f81bd" w:space="10" w:sz="4" w:val="single"/>
+        </w:pBdr>
+        <w:spacing w:after="240" w:before="240" w:lineRule="auto"/>
+        <w:jc w:val="left"/>
+        <w:rPr/>
+      </w:pPr>
+      <w:r>
+        <w:rPr>
+          <w:i w:val="1"/>
+          <w:iCs w:val="1"/>
+          <w:rtl w:val="0"/>
+        </w:rPr>
+        <w:t xml:space="preserve">I run ODAXY Labs. We built an English-learning app for iOS and Android, and a community app for high school students in New Jersey.</w:t>
+      </w:r>
+      <w:r>
+        <w:rPr>
+          <w:rtl w:val="0"/>
+        </w:rPr>
+      </w:r>
+    </w:p>
+    <w:p>
+      <w:pPr>
+        <w:pBdr>
+          <w:top w:color="4f81bd" w:space="10" w:sz="4" w:val="single"/>
+          <w:bottom w:color="4f81bd" w:space="10" w:sz="4" w:val="single"/>
+        </w:pBdr>
+        <w:spacing w:after="240" w:before="240" w:lineRule="auto"/>
+        <w:jc w:val="left"/>
+        <w:rPr/>
+      </w:pPr>
+      <w:r>
+        <w:rPr>
+          <w:i w:val="1"/>
+          <w:iCs w:val="1"/>
+          <w:rtl w:val="0"/>
+        </w:rPr>
+        <w:t xml:space="preserve">Would a couple of examples help?</w:t>
       </w:r>
       <w:r>
         <w:rPr>
@@ -4197,213 +4955,6 @@
           <w:iCs w:val="1"/>
           <w:rtl w:val="0"/>
         </w:rPr>
-        <w:t xml:space="preserve">Email 2 — Day 5</w:t>
-      </w:r>
-      <w:r>
-        <w:rPr>
-          <w:i w:val="1"/>
-          <w:iCs w:val="1"/>
-          <w:rtl w:val="0"/>
-        </w:rPr>
-        <w:t xml:space="preserve"> Subject: one more thing / the part that matters</w:t>
-      </w:r>
-      <w:r>
-        <w:rPr>
-          <w:rtl w:val="0"/>
-        </w:rPr>
-      </w:r>
-    </w:p>
-    <w:p>
-      <w:pPr>
-        <w:pBdr>
-          <w:top w:color="4f81bd" w:space="10" w:sz="4" w:val="single"/>
-          <w:bottom w:color="4f81bd" w:space="10" w:sz="4" w:val="single"/>
-        </w:pBdr>
-        <w:spacing w:after="240" w:before="240" w:lineRule="auto"/>
-        <w:jc w:val="left"/>
-        <w:rPr/>
-      </w:pPr>
-      <w:r>
-        <w:rPr>
-          <w:i w:val="1"/>
-          <w:iCs w:val="1"/>
-          <w:rtl w:val="0"/>
-        </w:rPr>
-        <w:t xml:space="preserve">Hi </w:t>
-      </w:r>
-      <w:r>
-        <w:rPr>
-          <w:b w:val="1"/>
-          <w:bCs w:val="1"/>
-          <w:i w:val="1"/>
-          <w:iCs w:val="1"/>
-          <w:color w:val="ff9900"/>
-          <w:rtl w:val="0"/>
-        </w:rPr>
-        <w:t xml:space="preserve">[First Name]</w:t>
-      </w:r>
-      <w:r>
-        <w:rPr>
-          <w:i w:val="1"/>
-          <w:iCs w:val="1"/>
-          <w:rtl w:val="0"/>
-        </w:rPr>
-        <w:t xml:space="preserve">,</w:t>
-      </w:r>
-      <w:r>
-        <w:rPr>
-          <w:rtl w:val="0"/>
-        </w:rPr>
-      </w:r>
-    </w:p>
-    <w:p>
-      <w:pPr>
-        <w:pBdr>
-          <w:top w:color="4f81bd" w:space="10" w:sz="4" w:val="single"/>
-          <w:bottom w:color="4f81bd" w:space="10" w:sz="4" w:val="single"/>
-        </w:pBdr>
-        <w:spacing w:after="240" w:before="240" w:lineRule="auto"/>
-        <w:jc w:val="left"/>
-        <w:rPr/>
-      </w:pPr>
-      <w:r>
-        <w:rPr>
-          <w:i w:val="1"/>
-          <w:iCs w:val="1"/>
-          <w:rtl w:val="0"/>
-        </w:rPr>
-        <w:t xml:space="preserve">Following up. For most agency owners, the biggest risk isn't the price. It's losing a retainer client because a partner missed a deadline.</w:t>
-      </w:r>
-      <w:r>
-        <w:rPr>
-          <w:rtl w:val="0"/>
-        </w:rPr>
-      </w:r>
-    </w:p>
-    <w:p>
-      <w:pPr>
-        <w:pBdr>
-          <w:top w:color="4f81bd" w:space="10" w:sz="4" w:val="single"/>
-          <w:bottom w:color="4f81bd" w:space="10" w:sz="4" w:val="single"/>
-        </w:pBdr>
-        <w:spacing w:after="240" w:before="240" w:lineRule="auto"/>
-        <w:jc w:val="left"/>
-        <w:rPr/>
-      </w:pPr>
-      <w:r>
-        <w:rPr>
-          <w:i w:val="1"/>
-          <w:iCs w:val="1"/>
-          <w:rtl w:val="0"/>
-        </w:rPr>
-        <w:t xml:space="preserve">With us, you talk to me directly, the scope is agreed in writing before we start, and the first version for a web agency in Pennsylvania was ready in about six weeks.</w:t>
-      </w:r>
-      <w:r>
-        <w:rPr>
-          <w:rtl w:val="0"/>
-        </w:rPr>
-      </w:r>
-    </w:p>
-    <w:p>
-      <w:pPr>
-        <w:pBdr>
-          <w:top w:color="4f81bd" w:space="10" w:sz="4" w:val="single"/>
-          <w:bottom w:color="4f81bd" w:space="10" w:sz="4" w:val="single"/>
-        </w:pBdr>
-        <w:spacing w:after="240" w:before="240" w:lineRule="auto"/>
-        <w:jc w:val="left"/>
-        <w:rPr/>
-      </w:pPr>
-      <w:r>
-        <w:rPr>
-          <w:i w:val="1"/>
-          <w:iCs w:val="1"/>
-          <w:rtl w:val="0"/>
-        </w:rPr>
-        <w:t xml:space="preserve">Want me to share how we set it up?</w:t>
-      </w:r>
-      <w:r>
-        <w:rPr>
-          <w:rtl w:val="0"/>
-        </w:rPr>
-      </w:r>
-    </w:p>
-    <w:p>
-      <w:pPr>
-        <w:pBdr>
-          <w:top w:color="4f81bd" w:space="10" w:sz="4" w:val="single"/>
-          <w:bottom w:color="4f81bd" w:space="10" w:sz="4" w:val="single"/>
-        </w:pBdr>
-        <w:spacing w:after="240" w:before="240" w:lineRule="auto"/>
-        <w:jc w:val="left"/>
-        <w:rPr/>
-      </w:pPr>
-      <w:r>
-        <w:rPr>
-          <w:i w:val="1"/>
-          <w:iCs w:val="1"/>
-          <w:rtl w:val="0"/>
-        </w:rPr>
-        <w:t xml:space="preserve">Best,</w:t>
-      </w:r>
-      <w:r>
-        <w:rPr>
-          <w:rtl w:val="0"/>
-        </w:rPr>
-      </w:r>
-    </w:p>
-    <w:p>
-      <w:pPr>
-        <w:pBdr>
-          <w:top w:color="4f81bd" w:space="10" w:sz="4" w:val="single"/>
-          <w:bottom w:color="4f81bd" w:space="10" w:sz="4" w:val="single"/>
-        </w:pBdr>
-        <w:spacing w:after="240" w:before="240" w:lineRule="auto"/>
-        <w:jc w:val="left"/>
-        <w:rPr/>
-      </w:pPr>
-      <w:r>
-        <w:rPr>
-          <w:i w:val="1"/>
-          <w:iCs w:val="1"/>
-          <w:rtl w:val="0"/>
-        </w:rPr>
-        <w:t xml:space="preserve">Igor</w:t>
-      </w:r>
-      <w:r>
-        <w:rPr>
-          <w:rtl w:val="0"/>
-        </w:rPr>
-      </w:r>
-    </w:p>
-    <w:p>
-      <w:pPr>
-        <w:rPr/>
-      </w:pPr>
-      <w:r>
-        <w:rPr>
-          <w:rtl w:val="0"/>
-        </w:rPr>
-      </w:r>
-    </w:p>
-    <w:p>
-      <w:pPr>
-        <w:pBdr>
-          <w:top w:color="4f81bd" w:space="10" w:sz="4" w:val="single"/>
-          <w:bottom w:color="4f81bd" w:space="10" w:sz="4" w:val="single"/>
-        </w:pBdr>
-        <w:spacing w:after="240" w:before="240" w:lineRule="auto"/>
-        <w:jc w:val="left"/>
-        <w:rPr/>
-      </w:pPr>
-      <w:r>
-        <w:rPr>
-          <w:b w:val="1"/>
-          <w:bCs w:val="1"/>
-          <w:i w:val="1"/>
-          <w:iCs w:val="1"/>
-          <w:rtl w:val="0"/>
-        </w:rPr>
         <w:t xml:space="preserve">Email 3 — Day 10</w:t>
       </w:r>
       <w:r>
@@ -4412,645 +4963,7 @@
           <w:iCs w:val="1"/>
           <w:rtl w:val="0"/>
         </w:rPr>
-        <w:t xml:space="preserve"> Subject: last one from me / inherited a client app?</w:t>
-      </w:r>
-      <w:r>
-        <w:rPr>
-          <w:rtl w:val="0"/>
-        </w:rPr>
-      </w:r>
-    </w:p>
-    <w:p>
-      <w:pPr>
-        <w:pBdr>
-          <w:top w:color="4f81bd" w:space="10" w:sz="4" w:val="single"/>
-          <w:bottom w:color="4f81bd" w:space="10" w:sz="4" w:val="single"/>
-        </w:pBdr>
-        <w:spacing w:after="240" w:before="240" w:lineRule="auto"/>
-        <w:jc w:val="left"/>
-        <w:rPr/>
-      </w:pPr>
-      <w:r>
-        <w:rPr>
-          <w:i w:val="1"/>
-          <w:iCs w:val="1"/>
-          <w:rtl w:val="0"/>
-        </w:rPr>
-        <w:t xml:space="preserve">Hi </w:t>
-      </w:r>
-      <w:r>
-        <w:rPr>
-          <w:b w:val="1"/>
-          <w:bCs w:val="1"/>
-          <w:i w:val="1"/>
-          <w:iCs w:val="1"/>
-          <w:color w:val="ff9900"/>
-          <w:rtl w:val="0"/>
-        </w:rPr>
-        <w:t xml:space="preserve">[First Name]</w:t>
-      </w:r>
-      <w:r>
-        <w:rPr>
-          <w:i w:val="1"/>
-          <w:iCs w:val="1"/>
-          <w:rtl w:val="0"/>
-        </w:rPr>
-        <w:t xml:space="preserve">,</w:t>
-      </w:r>
-      <w:r>
-        <w:rPr>
-          <w:rtl w:val="0"/>
-        </w:rPr>
-      </w:r>
-    </w:p>
-    <w:p>
-      <w:pPr>
-        <w:pBdr>
-          <w:top w:color="4f81bd" w:space="10" w:sz="4" w:val="single"/>
-          <w:bottom w:color="4f81bd" w:space="10" w:sz="4" w:val="single"/>
-        </w:pBdr>
-        <w:spacing w:after="240" w:before="240" w:lineRule="auto"/>
-        <w:jc w:val="left"/>
-        <w:rPr/>
-      </w:pPr>
-      <w:r>
-        <w:rPr>
-          <w:i w:val="1"/>
-          <w:iCs w:val="1"/>
-          <w:rtl w:val="0"/>
-        </w:rPr>
-        <w:t xml:space="preserve">Last note from me.</w:t>
-      </w:r>
-      <w:r>
-        <w:rPr>
-          <w:rtl w:val="0"/>
-        </w:rPr>
-      </w:r>
-    </w:p>
-    <w:p>
-      <w:pPr>
-        <w:pBdr>
-          <w:top w:color="4f81bd" w:space="10" w:sz="4" w:val="single"/>
-          <w:bottom w:color="4f81bd" w:space="10" w:sz="4" w:val="single"/>
-        </w:pBdr>
-        <w:spacing w:after="240" w:before="240" w:lineRule="auto"/>
-        <w:jc w:val="left"/>
-        <w:rPr/>
-      </w:pPr>
-      <w:r>
-        <w:rPr>
-          <w:i w:val="1"/>
-          <w:iCs w:val="1"/>
-          <w:rtl w:val="0"/>
-        </w:rPr>
-        <w:t xml:space="preserve">If you have a client app someone else built and you're not sure what's inside, I can do a free limited code review. A short written note on what's there, what's risky, and what it would take to keep it running.</w:t>
-      </w:r>
-      <w:r>
-        <w:rPr>
-          <w:rtl w:val="0"/>
-        </w:rPr>
-      </w:r>
-    </w:p>
-    <w:p>
-      <w:pPr>
-        <w:pBdr>
-          <w:top w:color="4f81bd" w:space="10" w:sz="4" w:val="single"/>
-          <w:bottom w:color="4f81bd" w:space="10" w:sz="4" w:val="single"/>
-        </w:pBdr>
-        <w:spacing w:after="240" w:before="240" w:lineRule="auto"/>
-        <w:jc w:val="left"/>
-        <w:rPr/>
-      </w:pPr>
-      <w:r>
-        <w:rPr>
-          <w:i w:val="1"/>
-          <w:iCs w:val="1"/>
-          <w:rtl w:val="0"/>
-        </w:rPr>
-        <w:t xml:space="preserve">You keep the note either way. Want me to look at one?</w:t>
-      </w:r>
-      <w:r>
-        <w:rPr>
-          <w:rtl w:val="0"/>
-        </w:rPr>
-      </w:r>
-    </w:p>
-    <w:p>
-      <w:pPr>
-        <w:pBdr>
-          <w:top w:color="4f81bd" w:space="10" w:sz="4" w:val="single"/>
-          <w:bottom w:color="4f81bd" w:space="10" w:sz="4" w:val="single"/>
-        </w:pBdr>
-        <w:spacing w:after="240" w:before="240" w:lineRule="auto"/>
-        <w:jc w:val="left"/>
-        <w:rPr/>
-      </w:pPr>
-      <w:r>
-        <w:rPr>
-          <w:i w:val="1"/>
-          <w:iCs w:val="1"/>
-          <w:rtl w:val="0"/>
-        </w:rPr>
-        <w:t xml:space="preserve">Best,</w:t>
-      </w:r>
-      <w:r>
-        <w:rPr>
-          <w:rtl w:val="0"/>
-        </w:rPr>
-      </w:r>
-    </w:p>
-    <w:p>
-      <w:pPr>
-        <w:pBdr>
-          <w:top w:color="4f81bd" w:space="10" w:sz="4" w:val="single"/>
-          <w:bottom w:color="4f81bd" w:space="10" w:sz="4" w:val="single"/>
-        </w:pBdr>
-        <w:spacing w:after="240" w:before="240" w:lineRule="auto"/>
-        <w:jc w:val="left"/>
-        <w:rPr/>
-      </w:pPr>
-      <w:r>
-        <w:rPr>
-          <w:i w:val="1"/>
-          <w:iCs w:val="1"/>
-          <w:rtl w:val="0"/>
-        </w:rPr>
-        <w:t xml:space="preserve">Igor</w:t>
-      </w:r>
-      <w:r>
-        <w:rPr>
-          <w:rtl w:val="0"/>
-        </w:rPr>
-      </w:r>
-    </w:p>
-    <w:p>
-      <w:pPr>
-        <w:rPr/>
-      </w:pPr>
-      <w:r>
-        <w:rPr>
-          <w:rtl w:val="0"/>
-        </w:rPr>
-      </w:r>
-    </w:p>
-    <w:p>
-      <w:pPr>
-        <w:pStyle w:val="Heading3"/>
-        <w:rPr/>
-      </w:pPr>
-      <w:r>
-        <w:rPr>
-          <w:rtl w:val="0"/>
-        </w:rPr>
-        <w:t xml:space="preserve">ICP 3 — Learning, Content and Community App Publishers</w:t>
-      </w:r>
-    </w:p>
-    <w:p>
-      <w:pPr>
-        <w:pBdr>
-          <w:top w:color="4f81bd" w:space="10" w:sz="4" w:val="single"/>
-          <w:bottom w:color="4f81bd" w:space="10" w:sz="4" w:val="single"/>
-        </w:pBdr>
-        <w:spacing w:after="240" w:before="240" w:lineRule="auto"/>
-        <w:jc w:val="left"/>
-        <w:rPr/>
-      </w:pPr>
-      <w:r>
-        <w:rPr>
-          <w:b w:val="1"/>
-          <w:bCs w:val="1"/>
-          <w:i w:val="1"/>
-          <w:iCs w:val="1"/>
-          <w:rtl w:val="0"/>
-        </w:rPr>
-        <w:t xml:space="preserve">Email 1 — Day 1</w:t>
-      </w:r>
-      <w:r>
-        <w:rPr>
-          <w:i w:val="1"/>
-          <w:iCs w:val="1"/>
-          <w:rtl w:val="0"/>
-        </w:rPr>
-        <w:t xml:space="preserve"> Subject: a churn question / quick question about {app name}</w:t>
-      </w:r>
-      <w:r>
-        <w:rPr>
-          <w:rtl w:val="0"/>
-        </w:rPr>
-      </w:r>
-    </w:p>
-    <w:p>
-      <w:pPr>
-        <w:pBdr>
-          <w:top w:color="4f81bd" w:space="10" w:sz="4" w:val="single"/>
-          <w:bottom w:color="4f81bd" w:space="10" w:sz="4" w:val="single"/>
-        </w:pBdr>
-        <w:spacing w:after="240" w:before="240" w:lineRule="auto"/>
-        <w:jc w:val="left"/>
-        <w:rPr/>
-      </w:pPr>
-      <w:r>
-        <w:rPr>
-          <w:i w:val="1"/>
-          <w:iCs w:val="1"/>
-          <w:rtl w:val="0"/>
-        </w:rPr>
-        <w:t xml:space="preserve">Hi </w:t>
-      </w:r>
-      <w:r>
-        <w:rPr>
-          <w:b w:val="1"/>
-          <w:bCs w:val="1"/>
-          <w:i w:val="1"/>
-          <w:iCs w:val="1"/>
-          <w:color w:val="ff9900"/>
-          <w:rtl w:val="0"/>
-        </w:rPr>
-        <w:t xml:space="preserve">[First Name]</w:t>
-      </w:r>
-      <w:r>
-        <w:rPr>
-          <w:i w:val="1"/>
-          <w:iCs w:val="1"/>
-          <w:rtl w:val="0"/>
-        </w:rPr>
-        <w:t xml:space="preserve">,</w:t>
-      </w:r>
-      <w:r>
-        <w:rPr>
-          <w:rtl w:val="0"/>
-        </w:rPr>
-      </w:r>
-    </w:p>
-    <w:p>
-      <w:pPr>
-        <w:pBdr>
-          <w:top w:color="4f81bd" w:space="10" w:sz="4" w:val="single"/>
-          <w:bottom w:color="4f81bd" w:space="10" w:sz="4" w:val="single"/>
-        </w:pBdr>
-        <w:spacing w:after="240" w:before="240" w:lineRule="auto"/>
-        <w:jc w:val="left"/>
-        <w:rPr/>
-      </w:pPr>
-      <w:r>
-        <w:rPr>
-          <w:i w:val="1"/>
-          <w:iCs w:val="1"/>
-          <w:rtl w:val="0"/>
-        </w:rPr>
-        <w:t xml:space="preserve">Tried reaching out on LinkedIn, but figured email might work better.</w:t>
-      </w:r>
-      <w:r>
-        <w:rPr>
-          <w:rtl w:val="0"/>
-        </w:rPr>
-      </w:r>
-    </w:p>
-    <w:p>
-      <w:pPr>
-        <w:pBdr>
-          <w:top w:color="4f81bd" w:space="10" w:sz="4" w:val="single"/>
-          <w:bottom w:color="4f81bd" w:space="10" w:sz="4" w:val="single"/>
-        </w:pBdr>
-        <w:spacing w:after="240" w:before="240" w:lineRule="auto"/>
-        <w:jc w:val="left"/>
-        <w:rPr/>
-      </w:pPr>
-      <w:r>
-        <w:rPr>
-          <w:i w:val="1"/>
-          <w:iCs w:val="1"/>
-          <w:rtl w:val="0"/>
-        </w:rPr>
-        <w:t xml:space="preserve">Most teams treat cancellations as a content problem. But on the App Store, around 14% of subscription cancellations are payments that failed. The user never chose to leave.</w:t>
-      </w:r>
-      <w:r>
-        <w:rPr>
-          <w:rtl w:val="0"/>
-        </w:rPr>
-      </w:r>
-    </w:p>
-    <w:p>
-      <w:pPr>
-        <w:pBdr>
-          <w:top w:color="4f81bd" w:space="10" w:sz="4" w:val="single"/>
-          <w:bottom w:color="4f81bd" w:space="10" w:sz="4" w:val="single"/>
-        </w:pBdr>
-        <w:spacing w:after="240" w:before="240" w:lineRule="auto"/>
-        <w:jc w:val="left"/>
-        <w:rPr/>
-      </w:pPr>
-      <w:r>
-        <w:rPr>
-          <w:i w:val="1"/>
-          <w:iCs w:val="1"/>
-          <w:rtl w:val="0"/>
-        </w:rPr>
-        <w:t xml:space="preserve">Do you know how many of yours fall into that bucket?</w:t>
-      </w:r>
-      <w:r>
-        <w:rPr>
-          <w:rtl w:val="0"/>
-        </w:rPr>
-      </w:r>
-    </w:p>
-    <w:p>
-      <w:pPr>
-        <w:pBdr>
-          <w:top w:color="4f81bd" w:space="10" w:sz="4" w:val="single"/>
-          <w:bottom w:color="4f81bd" w:space="10" w:sz="4" w:val="single"/>
-        </w:pBdr>
-        <w:spacing w:after="240" w:before="240" w:lineRule="auto"/>
-        <w:jc w:val="left"/>
-        <w:rPr/>
-      </w:pPr>
-      <w:r>
-        <w:rPr>
-          <w:i w:val="1"/>
-          <w:iCs w:val="1"/>
-          <w:rtl w:val="0"/>
-        </w:rPr>
-        <w:t xml:space="preserve">Best,</w:t>
-      </w:r>
-      <w:r>
-        <w:rPr>
-          <w:rtl w:val="0"/>
-        </w:rPr>
-      </w:r>
-    </w:p>
-    <w:p>
-      <w:pPr>
-        <w:pBdr>
-          <w:top w:color="4f81bd" w:space="10" w:sz="4" w:val="single"/>
-          <w:bottom w:color="4f81bd" w:space="10" w:sz="4" w:val="single"/>
-        </w:pBdr>
-        <w:spacing w:after="240" w:before="240" w:lineRule="auto"/>
-        <w:jc w:val="left"/>
-        <w:rPr/>
-      </w:pPr>
-      <w:r>
-        <w:rPr>
-          <w:i w:val="1"/>
-          <w:iCs w:val="1"/>
-          <w:rtl w:val="0"/>
-        </w:rPr>
-        <w:t xml:space="preserve">Igor</w:t>
-      </w:r>
-      <w:r>
-        <w:rPr>
-          <w:rtl w:val="0"/>
-        </w:rPr>
-      </w:r>
-    </w:p>
-    <w:p>
-      <w:pPr>
-        <w:rPr/>
-      </w:pPr>
-      <w:r>
-        <w:rPr>
-          <w:rtl w:val="0"/>
-        </w:rPr>
-      </w:r>
-    </w:p>
-    <w:p>
-      <w:pPr>
-        <w:pBdr>
-          <w:top w:color="4f81bd" w:space="10" w:sz="4" w:val="single"/>
-          <w:bottom w:color="4f81bd" w:space="10" w:sz="4" w:val="single"/>
-        </w:pBdr>
-        <w:spacing w:after="240" w:before="240" w:lineRule="auto"/>
-        <w:jc w:val="left"/>
-        <w:rPr/>
-      </w:pPr>
-      <w:r>
-        <w:rPr>
-          <w:b w:val="1"/>
-          <w:bCs w:val="1"/>
-          <w:i w:val="1"/>
-          <w:iCs w:val="1"/>
-          <w:rtl w:val="0"/>
-        </w:rPr>
-        <w:t xml:space="preserve">Email 2 — Day 5</w:t>
-      </w:r>
-      <w:r>
-        <w:rPr>
-          <w:i w:val="1"/>
-          <w:iCs w:val="1"/>
-          <w:rtl w:val="0"/>
-        </w:rPr>
-        <w:t xml:space="preserve"> Subject: one more thing / the first month</w:t>
-      </w:r>
-      <w:r>
-        <w:rPr>
-          <w:rtl w:val="0"/>
-        </w:rPr>
-      </w:r>
-    </w:p>
-    <w:p>
-      <w:pPr>
-        <w:pBdr>
-          <w:top w:color="4f81bd" w:space="10" w:sz="4" w:val="single"/>
-          <w:bottom w:color="4f81bd" w:space="10" w:sz="4" w:val="single"/>
-        </w:pBdr>
-        <w:spacing w:after="240" w:before="240" w:lineRule="auto"/>
-        <w:jc w:val="left"/>
-        <w:rPr/>
-      </w:pPr>
-      <w:r>
-        <w:rPr>
-          <w:i w:val="1"/>
-          <w:iCs w:val="1"/>
-          <w:rtl w:val="0"/>
-        </w:rPr>
-        <w:t xml:space="preserve">Hi </w:t>
-      </w:r>
-      <w:r>
-        <w:rPr>
-          <w:b w:val="1"/>
-          <w:bCs w:val="1"/>
-          <w:i w:val="1"/>
-          <w:iCs w:val="1"/>
-          <w:color w:val="ff9900"/>
-          <w:rtl w:val="0"/>
-        </w:rPr>
-        <w:t xml:space="preserve">[First Name]</w:t>
-      </w:r>
-      <w:r>
-        <w:rPr>
-          <w:i w:val="1"/>
-          <w:iCs w:val="1"/>
-          <w:rtl w:val="0"/>
-        </w:rPr>
-        <w:t xml:space="preserve">,</w:t>
-      </w:r>
-      <w:r>
-        <w:rPr>
-          <w:rtl w:val="0"/>
-        </w:rPr>
-      </w:r>
-    </w:p>
-    <w:p>
-      <w:pPr>
-        <w:pBdr>
-          <w:top w:color="4f81bd" w:space="10" w:sz="4" w:val="single"/>
-          <w:bottom w:color="4f81bd" w:space="10" w:sz="4" w:val="single"/>
-        </w:pBdr>
-        <w:spacing w:after="240" w:before="240" w:lineRule="auto"/>
-        <w:jc w:val="left"/>
-        <w:rPr/>
-      </w:pPr>
-      <w:r>
-        <w:rPr>
-          <w:i w:val="1"/>
-          <w:iCs w:val="1"/>
-          <w:rtl w:val="0"/>
-        </w:rPr>
-        <w:t xml:space="preserve">Following up. About a third of annual-plan cancellations happen in the first month, and a lot of that comes from the app: slow onboarding, crashes, or login issues. Better content doesn't fix any of it.</w:t>
-      </w:r>
-      <w:r>
-        <w:rPr>
-          <w:rtl w:val="0"/>
-        </w:rPr>
-      </w:r>
-    </w:p>
-    <w:p>
-      <w:pPr>
-        <w:pBdr>
-          <w:top w:color="4f81bd" w:space="10" w:sz="4" w:val="single"/>
-          <w:bottom w:color="4f81bd" w:space="10" w:sz="4" w:val="single"/>
-        </w:pBdr>
-        <w:spacing w:after="240" w:before="240" w:lineRule="auto"/>
-        <w:jc w:val="left"/>
-        <w:rPr/>
-      </w:pPr>
-      <w:r>
-        <w:rPr>
-          <w:i w:val="1"/>
-          <w:iCs w:val="1"/>
-          <w:rtl w:val="0"/>
-        </w:rPr>
-        <w:t xml:space="preserve">I run ODAXY Labs. We built an English-learning app for iOS and Android, and a community app for high school students in New Jersey.</w:t>
-      </w:r>
-      <w:r>
-        <w:rPr>
-          <w:rtl w:val="0"/>
-        </w:rPr>
-      </w:r>
-    </w:p>
-    <w:p>
-      <w:pPr>
-        <w:pBdr>
-          <w:top w:color="4f81bd" w:space="10" w:sz="4" w:val="single"/>
-          <w:bottom w:color="4f81bd" w:space="10" w:sz="4" w:val="single"/>
-        </w:pBdr>
-        <w:spacing w:after="240" w:before="240" w:lineRule="auto"/>
-        <w:jc w:val="left"/>
-        <w:rPr/>
-      </w:pPr>
-      <w:r>
-        <w:rPr>
-          <w:i w:val="1"/>
-          <w:iCs w:val="1"/>
-          <w:rtl w:val="0"/>
-        </w:rPr>
-        <w:t xml:space="preserve">Would a couple of examples help?</w:t>
-      </w:r>
-      <w:r>
-        <w:rPr>
-          <w:rtl w:val="0"/>
-        </w:rPr>
-      </w:r>
-    </w:p>
-    <w:p>
-      <w:pPr>
-        <w:pBdr>
-          <w:top w:color="4f81bd" w:space="10" w:sz="4" w:val="single"/>
-          <w:bottom w:color="4f81bd" w:space="10" w:sz="4" w:val="single"/>
-        </w:pBdr>
-        <w:spacing w:after="240" w:before="240" w:lineRule="auto"/>
-        <w:jc w:val="left"/>
-        <w:rPr/>
-      </w:pPr>
-      <w:r>
-        <w:rPr>
-          <w:i w:val="1"/>
-          <w:iCs w:val="1"/>
-          <w:rtl w:val="0"/>
-        </w:rPr>
-        <w:t xml:space="preserve">Best,</w:t>
-      </w:r>
-      <w:r>
-        <w:rPr>
-          <w:rtl w:val="0"/>
-        </w:rPr>
-      </w:r>
-    </w:p>
-    <w:p>
-      <w:pPr>
-        <w:pBdr>
-          <w:top w:color="4f81bd" w:space="10" w:sz="4" w:val="single"/>
-          <w:bottom w:color="4f81bd" w:space="10" w:sz="4" w:val="single"/>
-        </w:pBdr>
-        <w:spacing w:after="240" w:before="240" w:lineRule="auto"/>
-        <w:jc w:val="left"/>
-        <w:rPr/>
-      </w:pPr>
-      <w:r>
-        <w:rPr>
-          <w:i w:val="1"/>
-          <w:iCs w:val="1"/>
-          <w:rtl w:val="0"/>
-        </w:rPr>
-        <w:t xml:space="preserve">Igor</w:t>
-      </w:r>
-      <w:r>
-        <w:rPr>
-          <w:rtl w:val="0"/>
-        </w:rPr>
-      </w:r>
-    </w:p>
-    <w:p>
-      <w:pPr>
-        <w:rPr/>
-      </w:pPr>
-      <w:r>
-        <w:rPr>
-          <w:rtl w:val="0"/>
-        </w:rPr>
-      </w:r>
-    </w:p>
-    <w:p>
-      <w:pPr>
-        <w:pBdr>
-          <w:top w:color="4f81bd" w:space="10" w:sz="4" w:val="single"/>
-          <w:bottom w:color="4f81bd" w:space="10" w:sz="4" w:val="single"/>
-        </w:pBdr>
-        <w:spacing w:after="240" w:before="240" w:lineRule="auto"/>
-        <w:jc w:val="left"/>
-        <w:rPr/>
-      </w:pPr>
-      <w:r>
-        <w:rPr>
-          <w:b w:val="1"/>
-          <w:bCs w:val="1"/>
-          <w:i w:val="1"/>
-          <w:iCs w:val="1"/>
-          <w:rtl w:val="0"/>
-        </w:rPr>
-        <w:t xml:space="preserve">Email 3 — Day 10</w:t>
-      </w:r>
-      <w:r>
-        <w:rPr>
-          <w:i w:val="1"/>
-          <w:iCs w:val="1"/>
-          <w:rtl w:val="0"/>
-        </w:rPr>
-        <w:t xml:space="preserve"> Subject: last one from me / free audit for {app name}</w:t>
-      </w:r>
-      <w:r>
-        <w:rPr>
-          <w:rtl w:val="0"/>
-        </w:rPr>
+        <w:t xml:space="preserve"> Subject: last one from me / a free audit for your app</w:t>
       </w:r>
     </w:p>
     <w:p>

</xml_diff>

<commit_message>
Use direct call CTAs in the first emails for ICP 1 and ICP 3
Co-Authored-By: Claude Opus 5.5 <noreply@anthropic.com>
Claude-Session: https://claude.ai/code/session_01Lr1syY3hkLeZYJhtN2s4Rg
</commit_message>
<xml_diff>
--- a/Outreach Messages - ODAXY Labs.docx
+++ b/Outreach Messages - ODAXY Labs.docx
@@ -3370,12 +3370,26 @@
           <w:iCs w:val="1"/>
           <w:rtl w:val="0"/>
         </w:rPr>
-        <w:t xml:space="preserve">Is that something you're already on top of, or has it been sitting on the list?</w:t>
-      </w:r>
-      <w:r>
-        <w:rPr>
-          <w:rtl w:val="0"/>
-        </w:rPr>
+        <w:t xml:space="preserve">I run ODAXY Labs. We take over and rebuild apps like this while they stay live in the stores, so you don't have to manage any developers.</w:t>
+      </w:r>
+    </w:p>
+    <w:p>
+      <w:pPr>
+        <w:pBdr>
+          <w:top w:color="4f81bd" w:space="10" w:sz="4" w:val="single"/>
+          <w:bottom w:color="4f81bd" w:space="10" w:sz="4" w:val="single"/>
+        </w:pBdr>
+        <w:spacing w:after="240" w:before="240" w:lineRule="auto"/>
+        <w:jc w:val="left"/>
+        <w:rPr/>
+      </w:pPr>
+      <w:r>
+        <w:rPr>
+          <w:i w:val="1"/>
+          <w:iCs w:val="1"/>
+          <w:rtl w:val="0"/>
+        </w:rPr>
+        <w:t xml:space="preserve">Would a quick 15-minute call next week make sense to see where your app stands?</w:t>
       </w:r>
     </w:p>
     <w:p>
@@ -4664,12 +4678,26 @@
           <w:iCs w:val="1"/>
           <w:rtl w:val="0"/>
         </w:rPr>
-        <w:t xml:space="preserve">Do you know how many of yours fall into that bucket?</w:t>
-      </w:r>
-      <w:r>
-        <w:rPr>
-          <w:rtl w:val="0"/>
-        </w:rPr>
+        <w:t xml:space="preserve">I run ODAXY Labs. We build and take over learning apps for iOS and Android, so your team can focus on the content.</w:t>
+      </w:r>
+    </w:p>
+    <w:p>
+      <w:pPr>
+        <w:pBdr>
+          <w:top w:color="4f81bd" w:space="10" w:sz="4" w:val="single"/>
+          <w:bottom w:color="4f81bd" w:space="10" w:sz="4" w:val="single"/>
+        </w:pBdr>
+        <w:spacing w:after="240" w:before="240" w:lineRule="auto"/>
+        <w:jc w:val="left"/>
+        <w:rPr/>
+      </w:pPr>
+      <w:r>
+        <w:rPr>
+          <w:i w:val="1"/>
+          <w:iCs w:val="1"/>
+          <w:rtl w:val="0"/>
+        </w:rPr>
+        <w:t xml:space="preserve">Would a quick 15-minute call next week make sense to see how much of your churn could be coming from the app?</w:t>
       </w:r>
     </w:p>
     <w:p>

</xml_diff>

<commit_message>
Add a proper introduction to the first emails for ICP 1 and ICP 3
Co-Authored-By: Claude Opus 5.5 <noreply@anthropic.com>
Claude-Session: https://claude.ai/code/session_01Lr1syY3hkLeZYJhtN2s4Rg
</commit_message>
<xml_diff>
--- a/Outreach Messages - ODAXY Labs.docx
+++ b/Outreach Messages - ODAXY Labs.docx
@@ -3351,45 +3351,45 @@
           <w:iCs w:val="1"/>
           <w:rtl w:val="0"/>
         </w:rPr>
-        <w:t xml:space="preserve">Since this year, Apple only accepts app updates built with its latest tools, and Google stops showing apps that fall behind to people with newer Android phones. So an app that hasn't been updated in a while can get stuck without anyone noticing.</w:t>
-      </w:r>
-    </w:p>
-    <w:p>
-      <w:pPr>
-        <w:pBdr>
-          <w:top w:color="4f81bd" w:space="10" w:sz="4" w:val="single"/>
-          <w:bottom w:color="4f81bd" w:space="10" w:sz="4" w:val="single"/>
-        </w:pBdr>
-        <w:spacing w:after="240" w:before="240" w:lineRule="auto"/>
-        <w:jc w:val="left"/>
-        <w:rPr/>
-      </w:pPr>
-      <w:r>
-        <w:rPr>
-          <w:i w:val="1"/>
-          <w:iCs w:val="1"/>
-          <w:rtl w:val="0"/>
-        </w:rPr>
-        <w:t xml:space="preserve">I run ODAXY Labs. We take over and rebuild apps like this while they stay live in the stores, so you don't have to manage any developers.</w:t>
-      </w:r>
-    </w:p>
-    <w:p>
-      <w:pPr>
-        <w:pBdr>
-          <w:top w:color="4f81bd" w:space="10" w:sz="4" w:val="single"/>
-          <w:bottom w:color="4f81bd" w:space="10" w:sz="4" w:val="single"/>
-        </w:pBdr>
-        <w:spacing w:after="240" w:before="240" w:lineRule="auto"/>
-        <w:jc w:val="left"/>
-        <w:rPr/>
-      </w:pPr>
-      <w:r>
-        <w:rPr>
-          <w:i w:val="1"/>
-          <w:iCs w:val="1"/>
-          <w:rtl w:val="0"/>
-        </w:rPr>
-        <w:t xml:space="preserve">Would a quick 15-minute call next week make sense to see where your app stands?</w:t>
+        <w:t xml:space="preserve">I'm Igor, founder of ODAXY Labs. We take over and rebuild mobile apps while they stay live in the stores, so you don't have to manage any developers.</w:t>
+      </w:r>
+    </w:p>
+    <w:p>
+      <w:pPr>
+        <w:pBdr>
+          <w:top w:color="4f81bd" w:space="10" w:sz="4" w:val="single"/>
+          <w:bottom w:color="4f81bd" w:space="10" w:sz="4" w:val="single"/>
+        </w:pBdr>
+        <w:spacing w:after="240" w:before="240" w:lineRule="auto"/>
+        <w:jc w:val="left"/>
+        <w:rPr/>
+      </w:pPr>
+      <w:r>
+        <w:rPr>
+          <w:i w:val="1"/>
+          <w:iCs w:val="1"/>
+          <w:rtl w:val="0"/>
+        </w:rPr>
+        <w:t xml:space="preserve">The reason I'm writing: since this year, Apple only accepts app updates built with its latest tools, and Google stops showing apps that fall behind to people with newer Android phones. So an app that hasn't been updated in a while can get stuck without anyone noticing.</w:t>
+      </w:r>
+    </w:p>
+    <w:p>
+      <w:pPr>
+        <w:pBdr>
+          <w:top w:color="4f81bd" w:space="10" w:sz="4" w:val="single"/>
+          <w:bottom w:color="4f81bd" w:space="10" w:sz="4" w:val="single"/>
+        </w:pBdr>
+        <w:spacing w:after="240" w:before="240" w:lineRule="auto"/>
+        <w:jc w:val="left"/>
+        <w:rPr/>
+      </w:pPr>
+      <w:r>
+        <w:rPr>
+          <w:i w:val="1"/>
+          <w:iCs w:val="1"/>
+          <w:rtl w:val="0"/>
+        </w:rPr>
+        <w:t xml:space="preserve">Would a quick call make sense to see where your app stands?</w:t>
       </w:r>
     </w:p>
     <w:p>
@@ -4654,50 +4654,45 @@
           <w:iCs w:val="1"/>
           <w:rtl w:val="0"/>
         </w:rPr>
-        <w:t xml:space="preserve">Most teams treat cancellations as a content problem. But on the App Store, around 14% of subscription cancellations are payments that failed. The user never chose to leave.</w:t>
-      </w:r>
-      <w:r>
-        <w:rPr>
-          <w:rtl w:val="0"/>
-        </w:rPr>
-      </w:r>
-    </w:p>
-    <w:p>
-      <w:pPr>
-        <w:pBdr>
-          <w:top w:color="4f81bd" w:space="10" w:sz="4" w:val="single"/>
-          <w:bottom w:color="4f81bd" w:space="10" w:sz="4" w:val="single"/>
-        </w:pBdr>
-        <w:spacing w:after="240" w:before="240" w:lineRule="auto"/>
-        <w:jc w:val="left"/>
-        <w:rPr/>
-      </w:pPr>
-      <w:r>
-        <w:rPr>
-          <w:i w:val="1"/>
-          <w:iCs w:val="1"/>
-          <w:rtl w:val="0"/>
-        </w:rPr>
-        <w:t xml:space="preserve">I run ODAXY Labs. We build and take over learning apps for iOS and Android, so your team can focus on the content.</w:t>
-      </w:r>
-    </w:p>
-    <w:p>
-      <w:pPr>
-        <w:pBdr>
-          <w:top w:color="4f81bd" w:space="10" w:sz="4" w:val="single"/>
-          <w:bottom w:color="4f81bd" w:space="10" w:sz="4" w:val="single"/>
-        </w:pBdr>
-        <w:spacing w:after="240" w:before="240" w:lineRule="auto"/>
-        <w:jc w:val="left"/>
-        <w:rPr/>
-      </w:pPr>
-      <w:r>
-        <w:rPr>
-          <w:i w:val="1"/>
-          <w:iCs w:val="1"/>
-          <w:rtl w:val="0"/>
-        </w:rPr>
-        <w:t xml:space="preserve">Would a quick 15-minute call next week make sense to see how much of your churn could be coming from the app?</w:t>
+        <w:t xml:space="preserve">I'm Igor, founder of ODAXY Labs. We build and take over learning apps for iOS and Android, so teams like yours can focus on the content.</w:t>
+      </w:r>
+    </w:p>
+    <w:p>
+      <w:pPr>
+        <w:pBdr>
+          <w:top w:color="4f81bd" w:space="10" w:sz="4" w:val="single"/>
+          <w:bottom w:color="4f81bd" w:space="10" w:sz="4" w:val="single"/>
+        </w:pBdr>
+        <w:spacing w:after="240" w:before="240" w:lineRule="auto"/>
+        <w:jc w:val="left"/>
+        <w:rPr/>
+      </w:pPr>
+      <w:r>
+        <w:rPr>
+          <w:i w:val="1"/>
+          <w:iCs w:val="1"/>
+          <w:rtl w:val="0"/>
+        </w:rPr>
+        <w:t xml:space="preserve">The reason I'm writing: when subscribers cancel, most teams see it as a content problem. But on the App Store, around 14% of subscription cancellations are actually failed payments. Those users never chose to leave, and it usually gets counted as regular churn.</w:t>
+      </w:r>
+    </w:p>
+    <w:p>
+      <w:pPr>
+        <w:pBdr>
+          <w:top w:color="4f81bd" w:space="10" w:sz="4" w:val="single"/>
+          <w:bottom w:color="4f81bd" w:space="10" w:sz="4" w:val="single"/>
+        </w:pBdr>
+        <w:spacing w:after="240" w:before="240" w:lineRule="auto"/>
+        <w:jc w:val="left"/>
+        <w:rPr/>
+      </w:pPr>
+      <w:r>
+        <w:rPr>
+          <w:i w:val="1"/>
+          <w:iCs w:val="1"/>
+          <w:rtl w:val="0"/>
+        </w:rPr>
+        <w:t xml:space="preserve">Would a quick call make sense to see how much of your churn could be coming from the app?</w:t>
       </w:r>
     </w:p>
     <w:p>

</xml_diff>

<commit_message>
Make the Apple and Google rule wording match the official requirements
Co-Authored-By: Claude Opus 5.5 <noreply@anthropic.com>
Claude-Session: https://claude.ai/code/session_01Lr1syY3hkLeZYJhtN2s4Rg
</commit_message>
<xml_diff>
--- a/Outreach Messages - ODAXY Labs.docx
+++ b/Outreach Messages - ODAXY Labs.docx
@@ -124,7 +124,7 @@
         <w:rPr>
           <w:rtl w:val="0"/>
         </w:rPr>
-        <w:t xml:space="preserve">The timing is on their side. Since 2026, Apple only accepts app updates built with its latest tools, and Google stops showing apps that fall behind to users on newer Android devices. An app that hasn't been looked after is now a visible, dated problem, and none of the competitors we analysed talk about it.</w:t>
+        <w:t xml:space="preserve">The timing is on their side. Since 2026, Apple and Google only accept app updates built with recent tools, and Google hides older apps from new users on newer versions of Android. An app that hasn't been looked after is now a visible, dated problem, and none of the competitors we analysed talk about it.</w:t>
       </w:r>
     </w:p>
     <w:p>
@@ -1037,7 +1037,7 @@
           <w:iCs w:val="1"/>
           <w:rtl w:val="0"/>
         </w:rPr>
-        <w:t xml:space="preserve">. Since this year, Apple only accepts updates built with its latest tools, and Google stops showing apps that fall behind to people with newer Android phones. So an app that's been left alone for a while can get stuck without anyone noticing. Has that come up for </w:t>
+        <w:t xml:space="preserve">. Since this year, Apple and Google only accept app updates built with recent tools, and Google hides older apps from new users on newer versions of Android. So an app that's been left alone for a while can get stuck without anyone noticing. Has that come up for </w:t>
       </w:r>
       <w:r>
         <w:rPr>
@@ -1288,7 +1288,7 @@
           <w:iCs w:val="1"/>
           <w:rtl w:val="0"/>
         </w:rPr>
-        <w:t xml:space="preserve">, so I'll stop here before I start to annoy you. One last thing worth knowing. Since this year, Apple only accepts app updates built with its latest tools, and Google stops showing apps that fall behind to people with newer Android phones. I'm doing a free, limited technical audit for app owners, a short written note on where your app stands, what's behind any crashes or bad reviews, and whether it needs a fix or a rebuild. Would you like me to do one for your app?</w:t>
+        <w:t xml:space="preserve">, so I'll stop here before I start to annoy you. One last thing worth knowing. Since this year, Apple and Google only accept app updates built with recent tools, and Google hides older apps from new users on newer versions of Android. I'm doing a free, limited technical audit for app owners, a short written note on where your app stands, what's behind any crashes or bad reviews, and whether it needs a fix or a rebuild. Would you like me to do one for your app?</w:t>
       </w:r>
     </w:p>
     <w:p>
@@ -2802,7 +2802,7 @@
           <w:iCs w:val="1"/>
           <w:rtl w:val="0"/>
         </w:rPr>
-        <w:t xml:space="preserve">, so I'll stop here before I start to annoy you. One last thing worth knowing. Since this year, Apple only accepts app updates built with its latest tools, and Google stops showing apps that fall behind to people with newer Android phones. I'm doing a free, limited technical audit for learning apps, a short written note on whether your app is affected, plus the payment flow, crashes and speed. Would you like me to do one for your app?</w:t>
+        <w:t xml:space="preserve">, so I'll stop here before I start to annoy you. One last thing worth knowing. Since this year, Apple and Google only accept app updates built with recent tools, and Google hides older apps from new users on newer versions of Android. I'm doing a free, limited technical audit for learning apps, a short written note on whether your app is affected, plus the payment flow, crashes and speed. Would you like me to do one for your app?</w:t>
       </w:r>
     </w:p>
     <w:p>
@@ -3096,7 +3096,7 @@
           <w:iCs w:val="1"/>
           <w:rtl w:val="0"/>
         </w:rPr>
-        <w:t xml:space="preserve">. Since this year, Apple only accepts updates built with its latest tools, and Google stops showing apps that fall behind to people with newer Android phones. I'm doing a free limited technical audit, a short written note on where an app stands and what it would take to sort out. Would that be useful? Best, Igor</w:t>
+        <w:t xml:space="preserve">. Since this year, Apple and Google only accept app updates built with recent tools, and Google hides older apps from new users on newer versions of Android. I'm doing a free limited technical audit, a short written note on where an app stands and what it would take to sort out. Would that be useful? Best, Igor</w:t>
       </w:r>
       <w:r>
         <w:rPr>
@@ -3370,7 +3370,7 @@
           <w:iCs w:val="1"/>
           <w:rtl w:val="0"/>
         </w:rPr>
-        <w:t xml:space="preserve">The reason I'm writing: since this year, Apple only accepts app updates built with its latest tools, and Google stops showing apps that fall behind to people with newer Android phones. So an app that hasn't been updated in a while can get stuck without anyone noticing.</w:t>
+        <w:t xml:space="preserve">The reason I'm writing: since this year, Apple and Google only accept app updates built with recent tools, and Google hides older apps from new users on newer versions of Android. So an app that hasn't been updated in a while can get stuck without anyone noticing.</w:t>
       </w:r>
     </w:p>
     <w:p>
@@ -5072,7 +5072,7 @@
           <w:iCs w:val="1"/>
           <w:rtl w:val="0"/>
         </w:rPr>
-        <w:t xml:space="preserve">Since this year, Apple only accepts app updates built with its latest tools, and Google stops showing apps that fall behind to people with newer Android phones. I can do a free, limited technical audit of your app and send you a short written note on whether it's affected, plus the payment flow, crashes and speed.</w:t>
+        <w:t xml:space="preserve">Since this year, Apple and Google only accept app updates built with recent tools, and Google hides older apps from new users on newer versions of Android. I can do a free, limited technical audit of your app and send you a short written note on whether it's affected, plus the payment flow, crashes and speed.</w:t>
       </w:r>
     </w:p>
     <w:p>

</xml_diff>

<commit_message>
Shorten the ICP 3 free value message
Co-Authored-By: Claude Opus 5.5 <noreply@anthropic.com>
Claude-Session: https://claude.ai/code/session_01Lr1syY3hkLeZYJhtN2s4Rg
</commit_message>
<xml_diff>
--- a/Outreach Messages - ODAXY Labs.docx
+++ b/Outreach Messages - ODAXY Labs.docx
@@ -2783,7 +2783,7 @@
           <w:iCs w:val="1"/>
           <w:rtl w:val="0"/>
         </w:rPr>
-        <w:t xml:space="preserve">I guess you're busy, </w:t>
+        <w:t xml:space="preserve">One last thing worth knowing, </w:t>
       </w:r>
       <w:r>
         <w:rPr>
@@ -2802,7 +2802,7 @@
           <w:iCs w:val="1"/>
           <w:rtl w:val="0"/>
         </w:rPr>
-        <w:t xml:space="preserve">, so I'll stop here before I start to annoy you. One last thing worth knowing. Since this year, Apple and Google only accept app updates built with recent tools, and Google hides older apps from new users on newer versions of Android. I'm doing a free, limited technical audit for learning apps, a short written note on whether your app is affected, plus the payment flow, crashes and speed. Would you like me to do one for your app?</w:t>
+        <w:t xml:space="preserve">. Since this year, Apple only accepts app updates built with recent tools, and Google hides older apps from new users on newer versions of Android. I'm doing a free, limited technical audit for learning apps: a short note on whether yours is affected, plus payments, crashes, and speed. Want me to do one for your app?</w:t>
       </w:r>
     </w:p>
     <w:p>

</xml_diff>

<commit_message>
Shorten the ICP 1 free value message
Co-Authored-By: Claude Opus 5.5 <noreply@anthropic.com>
Claude-Session: https://claude.ai/code/session_01Lr1syY3hkLeZYJhtN2s4Rg
</commit_message>
<xml_diff>
--- a/Outreach Messages - ODAXY Labs.docx
+++ b/Outreach Messages - ODAXY Labs.docx
@@ -1269,7 +1269,7 @@
           <w:iCs w:val="1"/>
           <w:rtl w:val="0"/>
         </w:rPr>
-        <w:t xml:space="preserve">I guess you're busy, </w:t>
+        <w:t xml:space="preserve">One last thing worth knowing, </w:t>
       </w:r>
       <w:r>
         <w:rPr>
@@ -1288,7 +1288,7 @@
           <w:iCs w:val="1"/>
           <w:rtl w:val="0"/>
         </w:rPr>
-        <w:t xml:space="preserve">, so I'll stop here before I start to annoy you. One last thing worth knowing. Since this year, Apple and Google only accept app updates built with recent tools, and Google hides older apps from new users on newer versions of Android. I'm doing a free, limited technical audit for app owners, a short written note on where your app stands, what's behind any crashes or bad reviews, and whether it needs a fix or a rebuild. Would you like me to do one for your app?</w:t>
+        <w:t xml:space="preserve">. Since this year, Apple only accepts app updates built with recent tools, and Google hides older apps from new users on newer versions of Android. I'm doing a free, limited technical audit for app owners: a short note on whether yours is affected, what's behind any crashes or bad reviews, and if it needs a fix or a rebuild. Want me to do one for your app?</w:t>
       </w:r>
     </w:p>
     <w:p>

</xml_diff>

<commit_message>
Match the 15+ years claim to the research wording
Co-Authored-By: Claude Opus 5.5 <noreply@anthropic.com>
Claude-Session: https://claude.ai/code/session_01Lr1syY3hkLeZYJhtN2s4Rg
</commit_message>
<xml_diff>
--- a/Outreach Messages - ODAXY Labs.docx
+++ b/Outreach Messages - ODAXY Labs.docx
@@ -1172,7 +1172,7 @@
           <w:iCs w:val="1"/>
           <w:rtl w:val="0"/>
         </w:rPr>
-        <w:t xml:space="preserve">, I jumped into questions without properly introducing myself. I'm Igor, founder of ODAXY Labs. I've been building mobile apps for 15+ years, and we take over and rebuild apps that someone else built. For example, we rebuilt both the iOS and Android GPS audio-tour apps for a company in Los Angeles, with turn-by-turn navigation and offline mode, while the apps stayed live in the stores. If interested, happy to share how we did it.</w:t>
+        <w:t xml:space="preserve">, I jumped into questions without properly introducing myself. I'm Igor, founder of ODAXY Labs. I've been a developer for 15+ years, and we take over and rebuild apps that someone else built. For example, we rebuilt both the iOS and Android GPS audio-tour apps for a company in Los Angeles, with turn-by-turn navigation and offline mode, while the apps stayed live in the stores. If interested, happy to share how we did it.</w:t>
       </w:r>
       <w:r>
         <w:rPr>
@@ -2686,7 +2686,7 @@
           <w:iCs w:val="1"/>
           <w:rtl w:val="0"/>
         </w:rPr>
-        <w:t xml:space="preserve">, I jumped into questions without properly introducing myself. I'm Igor, founder of ODAXY Labs. I've been building mobile apps for 15+ years. We built an English-learning app for iOS and Android, and a mobile community app for high school students in New Jersey. We also run an app of our own, so we know what keeping a live product running takes. If interested, happy to share a couple of examples.</w:t>
+        <w:t xml:space="preserve">, I jumped into questions without properly introducing myself. I'm Igor, founder of ODAXY Labs. I've been a developer for 15+ years. We built an English-learning app for iOS and Android, and a mobile community app for high school students in New Jersey. We also run an app of our own, so we know what keeping a live product running takes. If interested, happy to share a couple of examples.</w:t>
       </w:r>
       <w:r>
         <w:rPr>

</xml_diff>

<commit_message>
Soften the question in the ICP 1 empathy message
Co-Authored-By: Claude Opus 5.5 <noreply@anthropic.com>
Claude-Session: https://claude.ai/code/session_01Lr1syY3hkLeZYJhtN2s4Rg
</commit_message>
<xml_diff>
--- a/Outreach Messages - ODAXY Labs.docx
+++ b/Outreach Messages - ODAXY Labs.docx
@@ -1037,31 +1037,7 @@
           <w:iCs w:val="1"/>
           <w:rtl w:val="0"/>
         </w:rPr>
-        <w:t xml:space="preserve">. Since this year, Apple and Google only accept app updates built with recent tools, and Google hides older apps from new users on newer versions of Android. So an app that's been left alone for a while can get stuck without anyone noticing. Has that come up for </w:t>
-      </w:r>
-      <w:r>
-        <w:rPr>
-          <w:b w:val="1"/>
-          <w:bCs w:val="1"/>
-          <w:i w:val="1"/>
-          <w:iCs w:val="1"/>
-          <w:color w:val="ff9900"/>
-          <w:rtl w:val="0"/>
-        </w:rPr>
-        <w:t xml:space="preserve">{app name}</w:t>
-      </w:r>
-      <w:r>
-        <w:rPr>
-          <w:i w:val="1"/>
-          <w:iCs w:val="1"/>
-          <w:rtl w:val="0"/>
-        </w:rPr>
-        <w:t xml:space="preserve">?</w:t>
-      </w:r>
-      <w:r>
-        <w:rPr>
-          <w:rtl w:val="0"/>
-        </w:rPr>
+        <w:t xml:space="preserve">. Since this year, Apple and Google only accept app updates built with recent tools, and Google hides older apps from new users on newer versions of Android. So an app that hasn't been updated in a while can get stuck without anyone noticing. Curious, is keeping the app up to date something someone on your team looks after, or does it tend to slip behind other priorities?</w:t>
       </w:r>
     </w:p>
     <w:p>

</xml_diff>